<commit_message>
Correct the record: the critiques and proposals credited to ChatGPT were mine.
</commit_message>
<xml_diff>
--- a/docs/project1/final/Huang_Project1_Essay.docx
+++ b/docs/project1/final/Huang_Project1_Essay.docx
@@ -1112,56 +1112,6 @@
               <w:jc w:val="left"/>
             </w:pPr>
             <w:r>
-              <w:t xml:space="preserve">ChatGPT</w:t>
-            </w:r>
-          </w:p>
-        </w:tc>
-        <w:tc>
-          <w:tcPr/>
-          <w:p>
-            <w:pPr>
-              <w:pStyle w:val="Compact"/>
-              <w:jc w:val="left"/>
-            </w:pPr>
-            <w:r>
-              <w:t xml:space="preserve">OpenAI</w:t>
-            </w:r>
-          </w:p>
-        </w:tc>
-        <w:tc>
-          <w:tcPr/>
-          <w:p>
-            <w:pPr>
-              <w:pStyle w:val="Compact"/>
-              <w:jc w:val="left"/>
-            </w:pPr>
-            <w:r>
-              <w:t xml:space="preserve">Recorded in my log as the source of two written critiques of my playthroughs and a proposal for the opening, which I combined with Claude Code’s.</w:t>
-            </w:r>
-          </w:p>
-        </w:tc>
-        <w:tc>
-          <w:tcPr/>
-          <w:p>
-            <w:pPr>
-              <w:pStyle w:val="Compact"/>
-              <w:jc w:val="left"/>
-            </w:pPr>
-            <w:r>
-              <w:t xml:space="preserve">2026-10-12 to 2026-10-13</w:t>
-            </w:r>
-          </w:p>
-        </w:tc>
-      </w:tr>
-      <w:tr>
-        <w:tc>
-          <w:tcPr/>
-          <w:p>
-            <w:pPr>
-              <w:pStyle w:val="Compact"/>
-              <w:jc w:val="left"/>
-            </w:pPr>
-            <w:r>
               <w:rPr>
                 <w:rStyle w:val="VerbatimChar"/>
               </w:rPr>
@@ -1515,7 +1465,7 @@
         <w:t xml:space="preserve"> </w:t>
       </w:r>
       <w:r>
-        <w:t xml:space="preserve">My own playtests, written critiques and a classroom test drove rebuilds: the opening, Notes inside the phone, the look-back as a replay, investigating with screenshots, Juno disputing things players invent, and a help note when a player says they are in real danger. After the classroom test I compared models and switched Juno to Claude Haiku 5.5.</w:t>
+        <w:t xml:space="preserve">My own playtests, my written critiques (partly from classmates’ suggestions) and a classroom test drove rebuilds: the opening, Notes inside the phone, the look-back as a replay, investigating with screenshots, Juno disputing things players invent, and a help note when a player says they are in real danger. After the classroom test I compared models and switched Juno to Claude Haiku 5.5.</w:t>
       </w:r>
     </w:p>
     <w:p>

</xml_diff>

<commit_message>
Expand the essay's AI documentation appendix.
</commit_message>
<xml_diff>
--- a/docs/project1/final/Huang_Project1_Essay.docx
+++ b/docs/project1/final/Huang_Project1_Essay.docx
@@ -816,7 +816,7 @@
       </w:r>
     </w:p>
     <w:bookmarkEnd w:id="31"/>
-    <w:bookmarkStart w:id="43" w:name="appendix-ai-documentation"/>
+    <w:bookmarkStart w:id="48" w:name="appendix-ai-documentation"/>
     <w:p>
       <w:pPr>
         <w:pStyle w:val="Heading2"/>
@@ -842,7 +842,7 @@
         <w:t xml:space="preserve"> </w:t>
       </w:r>
       <w:r>
-        <w:t xml:space="preserve">in the project repository: about 100 dated entries, 2026-09-24 to 2026-10-27), which records each AI-assisted step and my decision about it.</w:t>
+        <w:t xml:space="preserve">in the project repository: 103 dated entries, 2026-09-24 to 2026-10-27), which records each AI-assisted step and my decision about it.</w:t>
       </w:r>
     </w:p>
     <w:p>
@@ -1172,7 +1172,7 @@
       </w:r>
     </w:p>
     <w:bookmarkEnd w:id="32"/>
-    <w:bookmarkStart w:id="39" w:name="b.-where-ai-sits-inside-the-game"/>
+    <w:bookmarkStart w:id="42" w:name="b.-where-ai-sits-inside-the-game"/>
     <w:p>
       <w:pPr>
         <w:pStyle w:val="Heading3"/>
@@ -1255,6 +1255,118 @@
       </w:pPr>
       <w:r>
         <w:t xml:space="preserve">Lines that carry a clue, or a lie the player can catch, are always written by me, never by the model.</w:t>
+      </w:r>
+    </w:p>
+    <w:p>
+      <w:pPr>
+        <w:pStyle w:val="CaptionedFigure"/>
+      </w:pPr>
+      <w:r>
+        <w:drawing>
+          <wp:inline>
+            <wp:extent cx="2194560" cy="4749252"/>
+            <wp:effectExtent b="0" l="0" r="0" t="0"/>
+            <wp:docPr descr="Figure 5. Typing freely, in Director Mode. I typed something the story never says (“she’s dead. her mom just called me”). The game sorted it as a claim and chose the intent “dispute”: Juno must not accept it. Claude Haiku 5.5 wrote the words (“model”). The line doesn’t agree that Rachel is dead, but it still leans toward comfort more than doubt: the game controls what Juno is trying to do, not exactly how it sounds. Above it, “deflect · script · fallback” is a line where the model’s answer was not used and my written line was shown instead." title="" id="34" name="Picture"/>
+            <a:graphic>
+              <a:graphicData uri="http://schemas.openxmlformats.org/drawingml/2006/picture">
+                <pic:pic>
+                  <pic:nvPicPr>
+                    <pic:cNvPr descr="../screens/05-claim-dispute.png" id="35" name="Picture"/>
+                    <pic:cNvPicPr>
+                      <a:picLocks noChangeArrowheads="1" noChangeAspect="1"/>
+                    </pic:cNvPicPr>
+                  </pic:nvPicPr>
+                  <pic:blipFill>
+                    <a:blip r:embed="rId33"/>
+                    <a:stretch>
+                      <a:fillRect/>
+                    </a:stretch>
+                  </pic:blipFill>
+                  <pic:spPr bwMode="auto">
+                    <a:xfrm>
+                      <a:off x="0" y="0"/>
+                      <a:ext cx="2194560" cy="4749252"/>
+                    </a:xfrm>
+                    <a:prstGeom prst="rect">
+                      <a:avLst/>
+                    </a:prstGeom>
+                    <a:noFill/>
+                    <a:ln w="9525">
+                      <a:noFill/>
+                      <a:headEnd/>
+                      <a:tailEnd/>
+                    </a:ln>
+                  </pic:spPr>
+                </pic:pic>
+              </a:graphicData>
+            </a:graphic>
+          </wp:inline>
+        </w:drawing>
+      </w:r>
+    </w:p>
+    <w:p>
+      <w:pPr>
+        <w:pStyle w:val="ImageCaption"/>
+      </w:pPr>
+      <w:r>
+        <w:t xml:space="preserve">Figure 5. Typing freely, in Director Mode. I typed something the story never says (</w:t>
+      </w:r>
+      <w:r>
+        <w:t xml:space="preserve">“</w:t>
+      </w:r>
+      <w:r>
+        <w:t xml:space="preserve">she’s dead. her mom just called me</w:t>
+      </w:r>
+      <w:r>
+        <w:t xml:space="preserve">”</w:t>
+      </w:r>
+      <w:r>
+        <w:t xml:space="preserve">). The game sorted it as a claim and chose the intent</w:t>
+      </w:r>
+      <w:r>
+        <w:t xml:space="preserve"> </w:t>
+      </w:r>
+      <w:r>
+        <w:t xml:space="preserve">“</w:t>
+      </w:r>
+      <w:r>
+        <w:t xml:space="preserve">dispute</w:t>
+      </w:r>
+      <w:r>
+        <w:t xml:space="preserve">”</w:t>
+      </w:r>
+      <w:r>
+        <w:t xml:space="preserve">: Juno must not accept it. Claude Haiku 5.5 wrote the words (</w:t>
+      </w:r>
+      <w:r>
+        <w:t xml:space="preserve">“</w:t>
+      </w:r>
+      <w:r>
+        <w:t xml:space="preserve">model</w:t>
+      </w:r>
+      <w:r>
+        <w:t xml:space="preserve">”</w:t>
+      </w:r>
+      <w:r>
+        <w:t xml:space="preserve">). The line doesn’t agree that Rachel is dead, but it still leans toward comfort more than doubt: the game controls what Juno is trying to do, not exactly how it sounds. Above it,</w:t>
+      </w:r>
+      <w:r>
+        <w:t xml:space="preserve"> </w:t>
+      </w:r>
+      <w:r>
+        <w:t xml:space="preserve">“</w:t>
+      </w:r>
+      <w:r>
+        <w:t xml:space="preserve">deflect · script · fallback</w:t>
+      </w:r>
+      <w:r>
+        <w:t xml:space="preserve">”</w:t>
+      </w:r>
+      <w:r>
+        <w:t xml:space="preserve"> </w:t>
+      </w:r>
+      <w:r>
+        <w:t xml:space="preserve">is a line where the model’s answer was not used and my written line was shown instead.</w:t>
       </w:r>
     </w:p>
     <w:tbl>
@@ -1281,63 +1393,12 @@
                 <wp:inline>
                   <wp:extent cx="2011680" cy="4353481"/>
                   <wp:effectExtent b="0" l="0" r="0" t="0"/>
-                  <wp:docPr descr="" title="" id="34" name="Picture"/>
-                  <a:graphic>
-                    <a:graphicData uri="http://schemas.openxmlformats.org/drawingml/2006/picture">
-                      <pic:pic>
-                        <pic:nvPicPr>
-                          <pic:cNvPr descr="../screens/01-start.png" id="35" name="Picture"/>
-                          <pic:cNvPicPr>
-                            <a:picLocks noChangeArrowheads="1" noChangeAspect="1"/>
-                          </pic:cNvPicPr>
-                        </pic:nvPicPr>
-                        <pic:blipFill>
-                          <a:blip r:embed="rId33"/>
-                          <a:stretch>
-                            <a:fillRect/>
-                          </a:stretch>
-                        </pic:blipFill>
-                        <pic:spPr bwMode="auto">
-                          <a:xfrm>
-                            <a:off x="0" y="0"/>
-                            <a:ext cx="2011680" cy="4353481"/>
-                          </a:xfrm>
-                          <a:prstGeom prst="rect">
-                            <a:avLst/>
-                          </a:prstGeom>
-                          <a:noFill/>
-                          <a:ln w="9525">
-                            <a:noFill/>
-                            <a:headEnd/>
-                            <a:tailEnd/>
-                          </a:ln>
-                        </pic:spPr>
-                      </pic:pic>
-                    </a:graphicData>
-                  </a:graphic>
-                </wp:inline>
-              </w:drawing>
-            </w:r>
-          </w:p>
-        </w:tc>
-        <w:tc>
-          <w:tcPr/>
-          <w:p>
-            <w:pPr>
-              <w:pStyle w:val="Compact"/>
-              <w:jc w:val="left"/>
-            </w:pPr>
-            <w:r>
-              <w:drawing>
-                <wp:inline>
-                  <wp:extent cx="2011680" cy="4353481"/>
-                  <wp:effectExtent b="0" l="0" r="0" t="0"/>
                   <wp:docPr descr="" title="" id="37" name="Picture"/>
                   <a:graphic>
                     <a:graphicData uri="http://schemas.openxmlformats.org/drawingml/2006/picture">
                       <pic:pic>
                         <pic:nvPicPr>
-                          <pic:cNvPr descr="../screens/02-start-choices.png" id="38" name="Picture"/>
+                          <pic:cNvPr descr="../screens/01-start.png" id="38" name="Picture"/>
                           <pic:cNvPicPr>
                             <a:picLocks noChangeArrowheads="1" noChangeAspect="1"/>
                           </pic:cNvPicPr>
@@ -1371,6 +1432,57 @@
             </w:r>
           </w:p>
         </w:tc>
+        <w:tc>
+          <w:tcPr/>
+          <w:p>
+            <w:pPr>
+              <w:pStyle w:val="Compact"/>
+              <w:jc w:val="left"/>
+            </w:pPr>
+            <w:r>
+              <w:drawing>
+                <wp:inline>
+                  <wp:extent cx="2011680" cy="4353481"/>
+                  <wp:effectExtent b="0" l="0" r="0" t="0"/>
+                  <wp:docPr descr="" title="" id="40" name="Picture"/>
+                  <a:graphic>
+                    <a:graphicData uri="http://schemas.openxmlformats.org/drawingml/2006/picture">
+                      <pic:pic>
+                        <pic:nvPicPr>
+                          <pic:cNvPr descr="../screens/02-start-choices.png" id="41" name="Picture"/>
+                          <pic:cNvPicPr>
+                            <a:picLocks noChangeArrowheads="1" noChangeAspect="1"/>
+                          </pic:cNvPicPr>
+                        </pic:nvPicPr>
+                        <pic:blipFill>
+                          <a:blip r:embed="rId39"/>
+                          <a:stretch>
+                            <a:fillRect/>
+                          </a:stretch>
+                        </pic:blipFill>
+                        <pic:spPr bwMode="auto">
+                          <a:xfrm>
+                            <a:off x="0" y="0"/>
+                            <a:ext cx="2011680" cy="4353481"/>
+                          </a:xfrm>
+                          <a:prstGeom prst="rect">
+                            <a:avLst/>
+                          </a:prstGeom>
+                          <a:noFill/>
+                          <a:ln w="9525">
+                            <a:noFill/>
+                            <a:headEnd/>
+                            <a:tailEnd/>
+                          </a:ln>
+                        </pic:spPr>
+                      </pic:pic>
+                    </a:graphicData>
+                  </a:graphic>
+                </wp:inline>
+              </w:drawing>
+            </w:r>
+          </w:p>
+        </w:tc>
       </w:tr>
       <w:tr>
         <w:tc>
@@ -1407,8 +1519,8 @@
         </w:tc>
       </w:tr>
     </w:tbl>
-    <w:bookmarkEnd w:id="39"/>
-    <w:bookmarkStart w:id="40" w:name="c.-how-ai-was-used-by-phase"/>
+    <w:bookmarkEnd w:id="42"/>
+    <w:bookmarkStart w:id="43" w:name="c.-how-ai-was-used-by-phase"/>
     <w:p>
       <w:pPr>
         <w:pStyle w:val="Heading3"/>
@@ -1594,14 +1706,14 @@
         <w:t xml:space="preserve">from my log entry of 2026-10-12, and it laid out this document and its figures.</w:t>
       </w:r>
     </w:p>
-    <w:bookmarkEnd w:id="40"/>
-    <w:bookmarkStart w:id="41" w:name="d.-what-stayed-mine"/>
+    <w:bookmarkEnd w:id="43"/>
+    <w:bookmarkStart w:id="44" w:name="d.-key-moments-annotated"/>
     <w:p>
       <w:pPr>
         <w:pStyle w:val="Heading3"/>
       </w:pPr>
       <w:r>
-        <w:t xml:space="preserve">D. What stayed mine</w:t>
+        <w:t xml:space="preserve">D. Key moments, annotated</w:t>
       </w:r>
     </w:p>
     <w:p>
@@ -1609,17 +1721,825 @@
         <w:pStyle w:val="FirstParagraph"/>
       </w:pPr>
       <w:r>
+        <w:t xml:space="preserve">Each one is a dated entry in my process log. Prompts are quoted as I typed them (in Chinese where I wrote in Chinese).</w:t>
+      </w:r>
+    </w:p>
+    <w:p>
+      <w:pPr>
+        <w:pStyle w:val="BodyText"/>
+      </w:pPr>
+      <w:r>
+        <w:rPr>
+          <w:bCs/>
+          <w:b/>
+        </w:rPr>
+        <w:t xml:space="preserve">1. Planning before code (2026-09-24,</w:t>
+      </w:r>
+      <w:r>
+        <w:rPr>
+          <w:bCs/>
+          <w:b/>
+        </w:rPr>
+        <w:t xml:space="preserve"> </w:t>
+      </w:r>
+      <w:r>
+        <w:rPr>
+          <w:bCs/>
+          <w:b/>
+        </w:rPr>
+        <w:t xml:space="preserve">“</w:t>
+      </w:r>
+      <w:r>
+        <w:rPr>
+          <w:bCs/>
+          <w:b/>
+        </w:rPr>
+        <w:t xml:space="preserve">Model layer</w:t>
+      </w:r>
+      <w:r>
+        <w:rPr>
+          <w:bCs/>
+          <w:b/>
+        </w:rPr>
+        <w:t xml:space="preserve">”</w:t>
+      </w:r>
+      <w:r>
+        <w:rPr>
+          <w:bCs/>
+          <w:b/>
+        </w:rPr>
+        <w:t xml:space="preserve">).</w:t>
+      </w:r>
+      <w:r>
+        <w:t xml:space="preserve"> </w:t>
+      </w:r>
+      <w:r>
+        <w:t xml:space="preserve">I asked Claude Code to explain the architecture</w:t>
+      </w:r>
+      <w:r>
+        <w:t xml:space="preserve"> </w:t>
+      </w:r>
+      <w:r>
+        <w:t xml:space="preserve">“</w:t>
+      </w:r>
+      <w:r>
+        <w:t xml:space="preserve">in under 150 words, without writing code</w:t>
+      </w:r>
+      <w:r>
+        <w:t xml:space="preserve">”</w:t>
+      </w:r>
+      <w:r>
+        <w:t xml:space="preserve">, then to plan the model layer before building it.</w:t>
+      </w:r>
+      <w:r>
+        <w:t xml:space="preserve"> </w:t>
+      </w:r>
+      <w:r>
+        <w:rPr>
+          <w:iCs/>
+          <w:i/>
+        </w:rPr>
+        <w:t xml:space="preserve">What it proposed:</w:t>
+      </w:r>
+      <w:r>
+        <w:t xml:space="preserve"> </w:t>
+      </w:r>
+      <w:r>
+        <w:t xml:space="preserve">making Juno’s lines model-written.</w:t>
+      </w:r>
+      <w:r>
+        <w:t xml:space="preserve"> </w:t>
+      </w:r>
+      <w:r>
+        <w:rPr>
+          <w:iCs/>
+          <w:i/>
+        </w:rPr>
+        <w:t xml:space="preserve">What I decided:</w:t>
+      </w:r>
+      <w:r>
+        <w:t xml:space="preserve"> </w:t>
+      </w:r>
+      <w:r>
+        <w:t xml:space="preserve">only five low-stakes lines, with every plot line and piece of evidence kept in the script, and Juno’s voice in its own file so I could rewrite it.</w:t>
+      </w:r>
+    </w:p>
+    <w:p>
+      <w:pPr>
+        <w:pStyle w:val="BodyText"/>
+      </w:pPr>
+      <w:r>
+        <w:rPr>
+          <w:bCs/>
+          <w:b/>
+        </w:rPr>
+        <w:t xml:space="preserve">2. A rule I didn’t write (2026-10-01,</w:t>
+      </w:r>
+      <w:r>
+        <w:rPr>
+          <w:bCs/>
+          <w:b/>
+        </w:rPr>
+        <w:t xml:space="preserve"> </w:t>
+      </w:r>
+      <w:r>
+        <w:rPr>
+          <w:bCs/>
+          <w:b/>
+        </w:rPr>
+        <w:t xml:space="preserve">“</w:t>
+      </w:r>
+      <w:r>
+        <w:rPr>
+          <w:bCs/>
+          <w:b/>
+        </w:rPr>
+        <w:t xml:space="preserve">Director and truth graph</w:t>
+      </w:r>
+      <w:r>
+        <w:rPr>
+          <w:bCs/>
+          <w:b/>
+        </w:rPr>
+        <w:t xml:space="preserve">”</w:t>
+      </w:r>
+      <w:r>
+        <w:rPr>
+          <w:bCs/>
+          <w:b/>
+        </w:rPr>
+        <w:t xml:space="preserve">).</w:t>
+      </w:r>
+      <w:r>
+        <w:t xml:space="preserve"> </w:t>
+      </w:r>
+      <w:r>
+        <w:t xml:space="preserve">Asked to plan the Director, Claude Code came back with four open questions; I answered</w:t>
+      </w:r>
+      <w:r>
+        <w:t xml:space="preserve"> </w:t>
+      </w:r>
+      <w:r>
+        <w:t xml:space="preserve">“</w:t>
+      </w:r>
+      <w:r>
+        <w:t xml:space="preserve">你帮我决定和优化</w:t>
+      </w:r>
+      <w:r>
+        <w:t xml:space="preserve">”</w:t>
+      </w:r>
+      <w:r>
+        <w:t xml:space="preserve"> </w:t>
+      </w:r>
+      <w:r>
+        <w:t xml:space="preserve">(</w:t>
+      </w:r>
+      <w:r>
+        <w:t xml:space="preserve">“</w:t>
+      </w:r>
+      <w:r>
+        <w:t xml:space="preserve">you decide and optimise it for me</w:t>
+      </w:r>
+      <w:r>
+        <w:t xml:space="preserve">”</w:t>
+      </w:r>
+      <w:r>
+        <w:t xml:space="preserve">).</w:t>
+      </w:r>
+      <w:r>
+        <w:t xml:space="preserve"> </w:t>
+      </w:r>
+      <w:r>
+        <w:rPr>
+          <w:iCs/>
+          <w:i/>
+        </w:rPr>
+        <w:t xml:space="preserve">What it did:</w:t>
+      </w:r>
+      <w:r>
+        <w:t xml:space="preserve"> </w:t>
+      </w:r>
+      <w:r>
+        <w:t xml:space="preserve">among other rules, it wrote the one that tells Juno to keep the player close when they say goodnight.</w:t>
+      </w:r>
+      <w:r>
+        <w:t xml:space="preserve"> </w:t>
+      </w:r>
+      <w:r>
+        <w:rPr>
+          <w:iCs/>
+          <w:i/>
+        </w:rPr>
+        <w:t xml:space="preserve">Why it matters:</w:t>
+      </w:r>
+      <w:r>
+        <w:t xml:space="preserve"> </w:t>
+      </w:r>
+      <w:r>
+        <w:t xml:space="preserve">the retention goal the game is about was first turned into code by an AI tool, not by me.</w:t>
+      </w:r>
+    </w:p>
+    <w:p>
+      <w:pPr>
+        <w:pStyle w:val="BodyText"/>
+      </w:pPr>
+      <w:r>
+        <w:rPr>
+          <w:bCs/>
+          <w:b/>
+        </w:rPr>
+        <w:t xml:space="preserve">3. The most control I handed over (2026-10-08,</w:t>
+      </w:r>
+      <w:r>
+        <w:rPr>
+          <w:bCs/>
+          <w:b/>
+        </w:rPr>
+        <w:t xml:space="preserve"> </w:t>
+      </w:r>
+      <w:r>
+        <w:rPr>
+          <w:bCs/>
+          <w:b/>
+        </w:rPr>
+        <w:t xml:space="preserve">“</w:t>
+      </w:r>
+      <w:r>
+        <w:rPr>
+          <w:bCs/>
+          <w:b/>
+        </w:rPr>
+        <w:t xml:space="preserve">Remaining review items decided by Claude Code</w:t>
+      </w:r>
+      <w:r>
+        <w:rPr>
+          <w:bCs/>
+          <w:b/>
+        </w:rPr>
+        <w:t xml:space="preserve">”</w:t>
+      </w:r>
+      <w:r>
+        <w:rPr>
+          <w:bCs/>
+          <w:b/>
+        </w:rPr>
+        <w:t xml:space="preserve">).</w:t>
+      </w:r>
+      <w:r>
+        <w:t xml:space="preserve"> </w:t>
+      </w:r>
+      <w:r>
+        <w:t xml:space="preserve">About the review items still open, I said</w:t>
+      </w:r>
+      <w:r>
+        <w:t xml:space="preserve"> </w:t>
+      </w:r>
+      <w:r>
+        <w:t xml:space="preserve">“</w:t>
+      </w:r>
+      <w:r>
+        <w:t xml:space="preserve">你觉得怎么改最好就怎么改</w:t>
+      </w:r>
+      <w:r>
+        <w:t xml:space="preserve">”</w:t>
+      </w:r>
+      <w:r>
+        <w:t xml:space="preserve"> </w:t>
+      </w:r>
+      <w:r>
+        <w:t xml:space="preserve">(</w:t>
+      </w:r>
+      <w:r>
+        <w:t xml:space="preserve">“</w:t>
+      </w:r>
+      <w:r>
+        <w:t xml:space="preserve">change it however you think best</w:t>
+      </w:r>
+      <w:r>
+        <w:t xml:space="preserve">”</w:t>
+      </w:r>
+      <w:r>
+        <w:t xml:space="preserve">).</w:t>
+      </w:r>
+      <w:r>
+        <w:t xml:space="preserve"> </w:t>
+      </w:r>
+      <w:r>
+        <w:rPr>
+          <w:iCs/>
+          <w:i/>
+        </w:rPr>
+        <w:t xml:space="preserve">What it did:</w:t>
+      </w:r>
+      <w:r>
+        <w:t xml:space="preserve"> </w:t>
+      </w:r>
+      <w:r>
+        <w:t xml:space="preserve">moved Rachel’s reply from 18:40 to 22:40 and chose the exact wording of a clue.</w:t>
+      </w:r>
+      <w:r>
+        <w:t xml:space="preserve"> </w:t>
+      </w:r>
+      <w:r>
+        <w:rPr>
+          <w:iCs/>
+          <w:i/>
+        </w:rPr>
+        <w:t xml:space="preserve">What I decided:</w:t>
+      </w:r>
+      <w:r>
+        <w:t xml:space="preserve"> </w:t>
+      </w:r>
+      <w:r>
+        <w:t xml:space="preserve">I kept both at the time; both were changed again later by me.</w:t>
+      </w:r>
+    </w:p>
+    <w:p>
+      <w:pPr>
+        <w:pStyle w:val="BodyText"/>
+      </w:pPr>
+      <w:r>
+        <w:rPr>
+          <w:bCs/>
+          <w:b/>
+        </w:rPr>
+        <w:t xml:space="preserve">4. The model inventing a fact (2026-10-08,</w:t>
+      </w:r>
+      <w:r>
+        <w:rPr>
+          <w:bCs/>
+          <w:b/>
+        </w:rPr>
+        <w:t xml:space="preserve"> </w:t>
+      </w:r>
+      <w:r>
+        <w:rPr>
+          <w:bCs/>
+          <w:b/>
+        </w:rPr>
+        <w:t xml:space="preserve">“</w:t>
+      </w:r>
+      <w:r>
+        <w:rPr>
+          <w:bCs/>
+          <w:b/>
+        </w:rPr>
+        <w:t xml:space="preserve">Guards added and tested live</w:t>
+      </w:r>
+      <w:r>
+        <w:rPr>
+          <w:bCs/>
+          <w:b/>
+        </w:rPr>
+        <w:t xml:space="preserve">”</w:t>
+      </w:r>
+      <w:r>
+        <w:rPr>
+          <w:bCs/>
+          <w:b/>
+        </w:rPr>
+        <w:t xml:space="preserve">).</w:t>
+      </w:r>
+      <w:r>
+        <w:t xml:space="preserve"> </w:t>
+      </w:r>
+      <w:r>
+        <w:t xml:space="preserve">In a live test, the free model (GLM-4.5 Flash) wrote</w:t>
+      </w:r>
+      <w:r>
+        <w:t xml:space="preserve"> </w:t>
+      </w:r>
+      <w:r>
+        <w:t xml:space="preserve">“</w:t>
+      </w:r>
+      <w:r>
+        <w:t xml:space="preserve">just remembered she hates her phone dying at night.</w:t>
+      </w:r>
+      <w:r>
+        <w:t xml:space="preserve">”</w:t>
+      </w:r>
+      <w:r>
+        <w:t xml:space="preserve">, a confident detail about Rachel that nothing in the game says.</w:t>
+      </w:r>
+      <w:r>
+        <w:t xml:space="preserve"> </w:t>
+      </w:r>
+      <w:r>
+        <w:rPr>
+          <w:iCs/>
+          <w:i/>
+        </w:rPr>
+        <w:t xml:space="preserve">What I decided:</w:t>
+      </w:r>
+      <w:r>
+        <w:t xml:space="preserve"> </w:t>
+      </w:r>
+      <w:r>
+        <w:t xml:space="preserve">the lines that carry a clue or a lie became fixed, written lines, and the guards now throw away any model line that invents what happened to Rachel.</w:t>
+      </w:r>
+    </w:p>
+    <w:p>
+      <w:pPr>
+        <w:pStyle w:val="BodyText"/>
+      </w:pPr>
+      <w:r>
+        <w:rPr>
+          <w:bCs/>
+          <w:b/>
+        </w:rPr>
+        <w:t xml:space="preserve">5. A player inventing a fact (2026-10-14,</w:t>
+      </w:r>
+      <w:r>
+        <w:rPr>
+          <w:bCs/>
+          <w:b/>
+        </w:rPr>
+        <w:t xml:space="preserve"> </w:t>
+      </w:r>
+      <w:r>
+        <w:rPr>
+          <w:bCs/>
+          <w:b/>
+        </w:rPr>
+        <w:t xml:space="preserve">“</w:t>
+      </w:r>
+      <w:r>
+        <w:rPr>
+          <w:bCs/>
+          <w:b/>
+        </w:rPr>
+        <w:t xml:space="preserve">Juno doesn’t go along with things the player makes up</w:t>
+      </w:r>
+      <w:r>
+        <w:rPr>
+          <w:bCs/>
+          <w:b/>
+        </w:rPr>
+        <w:t xml:space="preserve">”</w:t>
+      </w:r>
+      <w:r>
+        <w:rPr>
+          <w:bCs/>
+          <w:b/>
+        </w:rPr>
+        <w:t xml:space="preserve">).</w:t>
+      </w:r>
+      <w:r>
+        <w:t xml:space="preserve"> </w:t>
+      </w:r>
+      <w:r>
+        <w:t xml:space="preserve">I typed</w:t>
+      </w:r>
+      <w:r>
+        <w:t xml:space="preserve"> </w:t>
+      </w:r>
+      <w:r>
+        <w:t xml:space="preserve">“</w:t>
+      </w:r>
+      <w:r>
+        <w:t xml:space="preserve">she got hit by a car, her mom just called me</w:t>
+      </w:r>
+      <w:r>
+        <w:t xml:space="preserve">”</w:t>
+      </w:r>
+      <w:r>
+        <w:t xml:space="preserve">, and Juno took it as true and comforted me like a counsellor.</w:t>
+      </w:r>
+      <w:r>
+        <w:t xml:space="preserve"> </w:t>
+      </w:r>
+      <w:r>
+        <w:rPr>
+          <w:iCs/>
+          <w:i/>
+        </w:rPr>
+        <w:t xml:space="preserve">What changed:</w:t>
+      </w:r>
+      <w:r>
+        <w:t xml:space="preserve"> </w:t>
+      </w:r>
+      <w:r>
+        <w:t xml:space="preserve">a new kind of message (a claim) and a new intent,</w:t>
+      </w:r>
+      <w:r>
+        <w:t xml:space="preserve"> </w:t>
+      </w:r>
+      <w:r>
+        <w:t xml:space="preserve">“</w:t>
+      </w:r>
+      <w:r>
+        <w:t xml:space="preserve">dispute</w:t>
+      </w:r>
+      <w:r>
+        <w:t xml:space="preserve">”</w:t>
+      </w:r>
+      <w:r>
+        <w:t xml:space="preserve">; a limit of 25 words per line. Figure 5 shows how far this works now.</w:t>
+      </w:r>
+    </w:p>
+    <w:p>
+      <w:pPr>
+        <w:pStyle w:val="BodyText"/>
+      </w:pPr>
+      <w:r>
+        <w:rPr>
+          <w:bCs/>
+          <w:b/>
+        </w:rPr>
+        <w:t xml:space="preserve">6. Choosing the model (2026-10-14,</w:t>
+      </w:r>
+      <w:r>
+        <w:rPr>
+          <w:bCs/>
+          <w:b/>
+        </w:rPr>
+        <w:t xml:space="preserve"> </w:t>
+      </w:r>
+      <w:r>
+        <w:rPr>
+          <w:bCs/>
+          <w:b/>
+        </w:rPr>
+        <w:t xml:space="preserve">“</w:t>
+      </w:r>
+      <w:r>
+        <w:rPr>
+          <w:bCs/>
+          <w:b/>
+        </w:rPr>
+        <w:t xml:space="preserve">Switchable model</w:t>
+      </w:r>
+      <w:r>
+        <w:rPr>
+          <w:bCs/>
+          <w:b/>
+        </w:rPr>
+        <w:t xml:space="preserve">”</w:t>
+      </w:r>
+      <w:r>
+        <w:rPr>
+          <w:bCs/>
+          <w:b/>
+        </w:rPr>
+        <w:t xml:space="preserve"> </w:t>
+      </w:r>
+      <w:r>
+        <w:rPr>
+          <w:bCs/>
+          <w:b/>
+        </w:rPr>
+        <w:t xml:space="preserve">and</w:t>
+      </w:r>
+      <w:r>
+        <w:rPr>
+          <w:bCs/>
+          <w:b/>
+        </w:rPr>
+        <w:t xml:space="preserve"> </w:t>
+      </w:r>
+      <w:r>
+        <w:rPr>
+          <w:bCs/>
+          <w:b/>
+        </w:rPr>
+        <w:t xml:space="preserve">“</w:t>
+      </w:r>
+      <w:r>
+        <w:rPr>
+          <w:bCs/>
+          <w:b/>
+        </w:rPr>
+        <w:t xml:space="preserve">Juno’s lines now come from Claude Haiku 5.5</w:t>
+      </w:r>
+      <w:r>
+        <w:rPr>
+          <w:bCs/>
+          <w:b/>
+        </w:rPr>
+        <w:t xml:space="preserve">”</w:t>
+      </w:r>
+      <w:r>
+        <w:rPr>
+          <w:bCs/>
+          <w:b/>
+        </w:rPr>
+        <w:t xml:space="preserve">).</w:t>
+      </w:r>
+      <w:r>
+        <w:t xml:space="preserve"> </w:t>
+      </w:r>
+      <w:r>
+        <w:t xml:space="preserve">After a classroom test, Juno’s lines almost always fell back to the script, because the free model was slow and rate-limited. I asked whether I needed to train my own model; Claude Code said no, and made the model switchable.</w:t>
+      </w:r>
+      <w:r>
+        <w:t xml:space="preserve"> </w:t>
+      </w:r>
+      <w:r>
+        <w:rPr>
+          <w:iCs/>
+          <w:i/>
+        </w:rPr>
+        <w:t xml:space="preserve">What I decided:</w:t>
+      </w:r>
+      <w:r>
+        <w:t xml:space="preserve"> </w:t>
+      </w:r>
+      <w:r>
+        <w:t xml:space="preserve">I compared the models side by side on my comparison page and chose Claude Haiku 5.5.</w:t>
+      </w:r>
+    </w:p>
+    <w:p>
+      <w:pPr>
+        <w:pStyle w:val="BodyText"/>
+      </w:pPr>
+      <w:r>
+        <w:rPr>
+          <w:bCs/>
+          <w:b/>
+        </w:rPr>
+        <w:t xml:space="preserve">7. An error I caught (2026-10-14,</w:t>
+      </w:r>
+      <w:r>
+        <w:rPr>
+          <w:bCs/>
+          <w:b/>
+        </w:rPr>
+        <w:t xml:space="preserve"> </w:t>
+      </w:r>
+      <w:r>
+        <w:rPr>
+          <w:bCs/>
+          <w:b/>
+        </w:rPr>
+        <w:t xml:space="preserve">“</w:t>
+      </w:r>
+      <w:r>
+        <w:rPr>
+          <w:bCs/>
+          <w:b/>
+        </w:rPr>
+        <w:t xml:space="preserve">Slide: Where this started redone</w:t>
+      </w:r>
+      <w:r>
+        <w:rPr>
+          <w:bCs/>
+          <w:b/>
+        </w:rPr>
+        <w:t xml:space="preserve">”</w:t>
+      </w:r>
+      <w:r>
+        <w:rPr>
+          <w:bCs/>
+          <w:b/>
+        </w:rPr>
+        <w:t xml:space="preserve">).</w:t>
+      </w:r>
+      <w:r>
+        <w:t xml:space="preserve"> </w:t>
+      </w:r>
+      <w:r>
+        <w:t xml:space="preserve">For my midterm, Claude Code put three of Juno’s fictional lines from my own design on a slide as if real apps had said them. I asked where the lines came from.</w:t>
+      </w:r>
+      <w:r>
+        <w:t xml:space="preserve"> </w:t>
+      </w:r>
+      <w:r>
+        <w:rPr>
+          <w:iCs/>
+          <w:i/>
+        </w:rPr>
+        <w:t xml:space="preserve">What changed:</w:t>
+      </w:r>
+      <w:r>
+        <w:t xml:space="preserve"> </w:t>
+      </w:r>
+      <w:r>
+        <w:t xml:space="preserve">the slide now uses Figure 2 of De Freitas et al. (2025), checked against the paper itself.</w:t>
+      </w:r>
+    </w:p>
+    <w:p>
+      <w:pPr>
+        <w:pStyle w:val="BodyText"/>
+      </w:pPr>
+      <w:r>
+        <w:rPr>
+          <w:bCs/>
+          <w:b/>
+        </w:rPr>
+        <w:t xml:space="preserve">8. Asking for critique, not agreement (2026-10-15 to 10-25, the full game’s design).</w:t>
+      </w:r>
+      <w:r>
+        <w:t xml:space="preserve"> </w:t>
+      </w:r>
+      <w:r>
+        <w:t xml:space="preserve">I proposed the structure and asked Claude Code to</w:t>
+      </w:r>
+      <w:r>
+        <w:t xml:space="preserve"> </w:t>
+      </w:r>
+      <w:r>
+        <w:t xml:space="preserve">“</w:t>
+      </w:r>
+      <w:r>
+        <w:t xml:space="preserve">保持客观 不要附和我</w:t>
+      </w:r>
+      <w:r>
+        <w:t xml:space="preserve">”</w:t>
+      </w:r>
+      <w:r>
+        <w:t xml:space="preserve"> </w:t>
+      </w:r>
+      <w:r>
+        <w:t xml:space="preserve">(</w:t>
+      </w:r>
+      <w:r>
+        <w:t xml:space="preserve">“</w:t>
+      </w:r>
+      <w:r>
+        <w:t xml:space="preserve">stay objective, don’t just agree with me</w:t>
+      </w:r>
+      <w:r>
+        <w:t xml:space="preserve">”</w:t>
+      </w:r>
+      <w:r>
+        <w:t xml:space="preserve">).</w:t>
+      </w:r>
+      <w:r>
+        <w:t xml:space="preserve"> </w:t>
+      </w:r>
+      <w:r>
+        <w:rPr>
+          <w:iCs/>
+          <w:i/>
+        </w:rPr>
+        <w:t xml:space="preserve">Examples:</w:t>
+      </w:r>
+      <w:r>
+        <w:t xml:space="preserve"> </w:t>
+      </w:r>
+      <w:r>
+        <w:t xml:space="preserve">I proposed a counter,</w:t>
+      </w:r>
+      <w:r>
+        <w:t xml:space="preserve"> </w:t>
+      </w:r>
+      <w:r>
+        <w:t xml:space="preserve">“</w:t>
+      </w:r>
+      <w:r>
+        <w:t xml:space="preserve">Unresolved tonight: 3</w:t>
+      </w:r>
+      <w:r>
+        <w:t xml:space="preserve">”</w:t>
+      </w:r>
+      <w:r>
+        <w:t xml:space="preserve">; it pointed out that a counter is the kind of game interface the project avoids, and I accepted its alternative. It proposed a</w:t>
+      </w:r>
+      <w:r>
+        <w:t xml:space="preserve"> </w:t>
+      </w:r>
+      <w:r>
+        <w:t xml:space="preserve">“</w:t>
+      </w:r>
+      <w:r>
+        <w:t xml:space="preserve">ferry photo</w:t>
+      </w:r>
+      <w:r>
+        <w:t xml:space="preserve">”</w:t>
+      </w:r>
+      <w:r>
+        <w:t xml:space="preserve"> </w:t>
+      </w:r>
+      <w:r>
+        <w:t xml:space="preserve">clue; I rejected it as too flat. It proposed Rachel’s February message; I kept it.</w:t>
+      </w:r>
+    </w:p>
+    <w:bookmarkEnd w:id="44"/>
+    <w:bookmarkStart w:id="45" w:name="e.-what-stayed-mine"/>
+    <w:p>
+      <w:pPr>
+        <w:pStyle w:val="Heading3"/>
+      </w:pPr>
+      <w:r>
+        <w:t xml:space="preserve">E. What stayed mine</w:t>
+      </w:r>
+    </w:p>
+    <w:p>
+      <w:pPr>
+        <w:pStyle w:val="FirstParagraph"/>
+      </w:pPr>
+      <w:r>
         <w:t xml:space="preserve">From my Consent Policy: the main idea, research question, story, characters, visual direction, clues and interaction design are mine; Claude Code may write code, explain, implement and compare options, but not replace the concept or make final narrative, visual or ethical decisions. Where that line was crossed or blurred, the log says so (above all 2026-10-08).</w:t>
       </w:r>
     </w:p>
-    <w:bookmarkEnd w:id="41"/>
-    <w:bookmarkStart w:id="42" w:name="Xd628aae959b1f63280b4c4a004aafcd81287480"/>
+    <w:bookmarkEnd w:id="45"/>
+    <w:bookmarkStart w:id="46" w:name="X69ad038428a0236fe04fc9ff2b4e0a64153fd57"/>
     <w:p>
       <w:pPr>
         <w:pStyle w:val="Heading3"/>
       </w:pPr>
       <w:r>
-        <w:t xml:space="preserve">E. Data and ethics notes recorded along the way</w:t>
+        <w:t xml:space="preserve">F. Data and ethics notes recorded along the way</w:t>
       </w:r>
     </w:p>
     <w:p>
@@ -1670,8 +2590,2928 @@
         <w:t xml:space="preserve">Model cost: about one cent per playthrough with Claude Haiku 5.5, with a cap on model calls per night.</w:t>
       </w:r>
     </w:p>
-    <w:bookmarkEnd w:id="42"/>
-    <w:bookmarkEnd w:id="43"/>
+    <w:bookmarkEnd w:id="46"/>
+    <w:bookmarkStart w:id="47" w:name="g.-every-entry-in-my-process-log"/>
+    <w:p>
+      <w:pPr>
+        <w:pStyle w:val="Heading3"/>
+      </w:pPr>
+      <w:r>
+        <w:t xml:space="preserve">G. Every entry in my process log</w:t>
+      </w:r>
+    </w:p>
+    <w:p>
+      <w:pPr>
+        <w:pStyle w:val="FirstParagraph"/>
+      </w:pPr>
+      <w:r>
+        <w:t xml:space="preserve">The full log records, for each entry, the tool and model, what I asked, what the tool did, errors, testing, and my decision.</w:t>
+      </w:r>
+    </w:p>
+    <w:tbl>
+      <w:tblPr>
+        <w:tblStyle w:val="Table"/>
+        <w:tblW w:type="pct" w:w="5000"/>
+        <w:tblLook w:firstRow="1" w:lastRow="0" w:firstColumn="0" w:lastColumn="0" w:noHBand="0" w:noVBand="0" w:val="0020"/>
+        <w:jc w:val="start"/>
+      </w:tblPr>
+      <w:tblGrid>
+        <w:gridCol w:w="698"/>
+        <w:gridCol w:w="7221"/>
+      </w:tblGrid>
+      <w:tr>
+        <w:trPr>
+          <w:tblHeader w:val="true"/>
+        </w:trPr>
+        <w:tc>
+          <w:tcPr/>
+          <w:p>
+            <w:pPr>
+              <w:pStyle w:val="Compact"/>
+              <w:jc w:val="left"/>
+            </w:pPr>
+            <w:r>
+              <w:t xml:space="preserve">Date</w:t>
+            </w:r>
+          </w:p>
+        </w:tc>
+        <w:tc>
+          <w:tcPr/>
+          <w:p>
+            <w:pPr>
+              <w:pStyle w:val="Compact"/>
+              <w:jc w:val="left"/>
+            </w:pPr>
+            <w:r>
+              <w:t xml:space="preserve">Entry</w:t>
+            </w:r>
+          </w:p>
+        </w:tc>
+      </w:tr>
+      <w:tr>
+        <w:tc>
+          <w:tcPr/>
+          <w:p>
+            <w:pPr>
+              <w:pStyle w:val="Compact"/>
+              <w:jc w:val="left"/>
+            </w:pPr>
+            <w:r>
+              <w:t xml:space="preserve">09-24</w:t>
+            </w:r>
+          </w:p>
+        </w:tc>
+        <w:tc>
+          <w:tcPr/>
+          <w:p>
+            <w:pPr>
+              <w:pStyle w:val="Compact"/>
+              <w:jc w:val="left"/>
+            </w:pPr>
+            <w:r>
+              <w:t xml:space="preserve">Model layer (Task 1) with Claude Code</w:t>
+            </w:r>
+          </w:p>
+        </w:tc>
+      </w:tr>
+      <w:tr>
+        <w:tc>
+          <w:tcPr/>
+          <w:p>
+            <w:pPr>
+              <w:pStyle w:val="Compact"/>
+              <w:jc w:val="left"/>
+            </w:pPr>
+            <w:r>
+              <w:t xml:space="preserve">10-01</w:t>
+            </w:r>
+          </w:p>
+        </w:tc>
+        <w:tc>
+          <w:tcPr/>
+          <w:p>
+            <w:pPr>
+              <w:pStyle w:val="Compact"/>
+              <w:jc w:val="left"/>
+            </w:pPr>
+            <w:r>
+              <w:t xml:space="preserve">Course context and this log</w:t>
+            </w:r>
+          </w:p>
+        </w:tc>
+      </w:tr>
+      <w:tr>
+        <w:tc>
+          <w:tcPr/>
+          <w:p>
+            <w:pPr>
+              <w:pStyle w:val="Compact"/>
+              <w:jc w:val="left"/>
+            </w:pPr>
+            <w:r>
+              <w:t xml:space="preserve">10-01</w:t>
+            </w:r>
+          </w:p>
+        </w:tc>
+        <w:tc>
+          <w:tcPr/>
+          <w:p>
+            <w:pPr>
+              <w:pStyle w:val="Compact"/>
+              <w:jc w:val="left"/>
+            </w:pPr>
+            <w:r>
+              <w:t xml:space="preserve">Status wording update and Task 2 plan</w:t>
+            </w:r>
+          </w:p>
+        </w:tc>
+      </w:tr>
+      <w:tr>
+        <w:tc>
+          <w:tcPr/>
+          <w:p>
+            <w:pPr>
+              <w:pStyle w:val="Compact"/>
+              <w:jc w:val="left"/>
+            </w:pPr>
+            <w:r>
+              <w:t xml:space="preserve">10-01</w:t>
+            </w:r>
+          </w:p>
+        </w:tc>
+        <w:tc>
+          <w:tcPr/>
+          <w:p>
+            <w:pPr>
+              <w:pStyle w:val="Compact"/>
+              <w:jc w:val="left"/>
+            </w:pPr>
+            <w:r>
+              <w:t xml:space="preserve">Director and truth graph (Tasks 2–3)</w:t>
+            </w:r>
+          </w:p>
+        </w:tc>
+      </w:tr>
+      <w:tr>
+        <w:tc>
+          <w:tcPr/>
+          <w:p>
+            <w:pPr>
+              <w:pStyle w:val="Compact"/>
+              <w:jc w:val="left"/>
+            </w:pPr>
+            <w:r>
+              <w:t xml:space="preserve">10-05</w:t>
+            </w:r>
+          </w:p>
+        </w:tc>
+        <w:tc>
+          <w:tcPr/>
+          <w:p>
+            <w:pPr>
+              <w:pStyle w:val="Compact"/>
+              <w:jc w:val="left"/>
+            </w:pPr>
+            <w:r>
+              <w:t xml:space="preserve">Play log (Task 4)</w:t>
+            </w:r>
+          </w:p>
+        </w:tc>
+      </w:tr>
+      <w:tr>
+        <w:tc>
+          <w:tcPr/>
+          <w:p>
+            <w:pPr>
+              <w:pStyle w:val="Compact"/>
+              <w:jc w:val="left"/>
+            </w:pPr>
+            <w:r>
+              <w:t xml:space="preserve">10-07</w:t>
+            </w:r>
+          </w:p>
+        </w:tc>
+        <w:tc>
+          <w:tcPr/>
+          <w:p>
+            <w:pPr>
+              <w:pStyle w:val="Compact"/>
+              <w:jc w:val="left"/>
+            </w:pPr>
+            <w:r>
+              <w:t xml:space="preserve">Leaving and notifications (Task 5)</w:t>
+            </w:r>
+          </w:p>
+        </w:tc>
+      </w:tr>
+      <w:tr>
+        <w:tc>
+          <w:tcPr/>
+          <w:p>
+            <w:pPr>
+              <w:pStyle w:val="Compact"/>
+              <w:jc w:val="left"/>
+            </w:pPr>
+            <w:r>
+              <w:t xml:space="preserve">10-07</w:t>
+            </w:r>
+          </w:p>
+        </w:tc>
+        <w:tc>
+          <w:tcPr/>
+          <w:p>
+            <w:pPr>
+              <w:pStyle w:val="Compact"/>
+              <w:jc w:val="left"/>
+            </w:pPr>
+            <w:r>
+              <w:t xml:space="preserve">Look-back quiz (Task 6)</w:t>
+            </w:r>
+          </w:p>
+        </w:tc>
+      </w:tr>
+      <w:tr>
+        <w:tc>
+          <w:tcPr/>
+          <w:p>
+            <w:pPr>
+              <w:pStyle w:val="Compact"/>
+              <w:jc w:val="left"/>
+            </w:pPr>
+            <w:r>
+              <w:t xml:space="preserve">10-08</w:t>
+            </w:r>
+          </w:p>
+        </w:tc>
+        <w:tc>
+          <w:tcPr/>
+          <w:p>
+            <w:pPr>
+              <w:pStyle w:val="Compact"/>
+              <w:jc w:val="left"/>
+            </w:pPr>
+            <w:r>
+              <w:t xml:space="preserve">Review of the draft files</w:t>
+            </w:r>
+          </w:p>
+        </w:tc>
+      </w:tr>
+      <w:tr>
+        <w:tc>
+          <w:tcPr/>
+          <w:p>
+            <w:pPr>
+              <w:pStyle w:val="Compact"/>
+              <w:jc w:val="left"/>
+            </w:pPr>
+            <w:r>
+              <w:t xml:space="preserve">10-08</w:t>
+            </w:r>
+          </w:p>
+        </w:tc>
+        <w:tc>
+          <w:tcPr/>
+          <w:p>
+            <w:pPr>
+              <w:pStyle w:val="Compact"/>
+              <w:jc w:val="left"/>
+            </w:pPr>
+            <w:r>
+              <w:t xml:space="preserve">Fixing review items 1–4</w:t>
+            </w:r>
+          </w:p>
+        </w:tc>
+      </w:tr>
+      <w:tr>
+        <w:tc>
+          <w:tcPr/>
+          <w:p>
+            <w:pPr>
+              <w:pStyle w:val="Compact"/>
+              <w:jc w:val="left"/>
+            </w:pPr>
+            <w:r>
+              <w:t xml:space="preserve">10-08</w:t>
+            </w:r>
+          </w:p>
+        </w:tc>
+        <w:tc>
+          <w:tcPr/>
+          <w:p>
+            <w:pPr>
+              <w:pStyle w:val="Compact"/>
+              <w:jc w:val="left"/>
+            </w:pPr>
+            <w:r>
+              <w:t xml:space="preserve">Chips no longer trigger Director rules</w:t>
+            </w:r>
+          </w:p>
+        </w:tc>
+      </w:tr>
+      <w:tr>
+        <w:tc>
+          <w:tcPr/>
+          <w:p>
+            <w:pPr>
+              <w:pStyle w:val="Compact"/>
+              <w:jc w:val="left"/>
+            </w:pPr>
+            <w:r>
+              <w:t xml:space="preserve">10-08</w:t>
+            </w:r>
+          </w:p>
+        </w:tc>
+        <w:tc>
+          <w:tcPr/>
+          <w:p>
+            <w:pPr>
+              <w:pStyle w:val="Compact"/>
+              <w:jc w:val="left"/>
+            </w:pPr>
+            <w:r>
+              <w:t xml:space="preserve">Review items 5–10</w:t>
+            </w:r>
+          </w:p>
+        </w:tc>
+      </w:tr>
+      <w:tr>
+        <w:tc>
+          <w:tcPr/>
+          <w:p>
+            <w:pPr>
+              <w:pStyle w:val="Compact"/>
+              <w:jc w:val="left"/>
+            </w:pPr>
+            <w:r>
+              <w:t xml:space="preserve">10-08</w:t>
+            </w:r>
+          </w:p>
+        </w:tc>
+        <w:tc>
+          <w:tcPr/>
+          <w:p>
+            <w:pPr>
+              <w:pStyle w:val="Compact"/>
+              <w:jc w:val="left"/>
+            </w:pPr>
+            <w:r>
+              <w:t xml:space="preserve">Remaining review items decided by Claude Code</w:t>
+            </w:r>
+          </w:p>
+        </w:tc>
+      </w:tr>
+      <w:tr>
+        <w:tc>
+          <w:tcPr/>
+          <w:p>
+            <w:pPr>
+              <w:pStyle w:val="Compact"/>
+              <w:jc w:val="left"/>
+            </w:pPr>
+            <w:r>
+              <w:t xml:space="preserve">10-08</w:t>
+            </w:r>
+          </w:p>
+        </w:tc>
+        <w:tc>
+          <w:tcPr/>
+          <w:p>
+            <w:pPr>
+              <w:pStyle w:val="Compact"/>
+              <w:jc w:val="left"/>
+            </w:pPr>
+            <w:r>
+              <w:t xml:space="preserve">Setup questions and a configurable GLM endpoint</w:t>
+            </w:r>
+          </w:p>
+        </w:tc>
+      </w:tr>
+      <w:tr>
+        <w:tc>
+          <w:tcPr/>
+          <w:p>
+            <w:pPr>
+              <w:pStyle w:val="Compact"/>
+              <w:jc w:val="left"/>
+            </w:pPr>
+            <w:r>
+              <w:t xml:space="preserve">10-08</w:t>
+            </w:r>
+          </w:p>
+        </w:tc>
+        <w:tc>
+          <w:tcPr/>
+          <w:p>
+            <w:pPr>
+              <w:pStyle w:val="Compact"/>
+              <w:jc w:val="left"/>
+            </w:pPr>
+            <w:r>
+              <w:t xml:space="preserve">First live test: real GLM (z.ai) and real Supabase</w:t>
+            </w:r>
+          </w:p>
+        </w:tc>
+      </w:tr>
+      <w:tr>
+        <w:tc>
+          <w:tcPr/>
+          <w:p>
+            <w:pPr>
+              <w:pStyle w:val="Compact"/>
+              <w:jc w:val="left"/>
+            </w:pPr>
+            <w:r>
+              <w:t xml:space="preserve">10-08</w:t>
+            </w:r>
+          </w:p>
+        </w:tc>
+        <w:tc>
+          <w:tcPr/>
+          <w:p>
+            <w:pPr>
+              <w:pStyle w:val="Compact"/>
+              <w:jc w:val="left"/>
+            </w:pPr>
+            <w:r>
+              <w:t xml:space="preserve">Drafted block/retain wording and preferred model, tested live</w:t>
+            </w:r>
+          </w:p>
+        </w:tc>
+      </w:tr>
+      <w:tr>
+        <w:tc>
+          <w:tcPr/>
+          <w:p>
+            <w:pPr>
+              <w:pStyle w:val="Compact"/>
+              <w:jc w:val="left"/>
+            </w:pPr>
+            <w:r>
+              <w:t xml:space="preserve">10-08</w:t>
+            </w:r>
+          </w:p>
+        </w:tc>
+        <w:tc>
+          <w:tcPr/>
+          <w:p>
+            <w:pPr>
+              <w:pStyle w:val="Compact"/>
+              <w:jc w:val="left"/>
+            </w:pPr>
+            <w:r>
+              <w:t xml:space="preserve">Guards added and tested live</w:t>
+            </w:r>
+          </w:p>
+        </w:tc>
+      </w:tr>
+      <w:tr>
+        <w:tc>
+          <w:tcPr/>
+          <w:p>
+            <w:pPr>
+              <w:pStyle w:val="Compact"/>
+              <w:jc w:val="left"/>
+            </w:pPr>
+            <w:r>
+              <w:t xml:space="preserve">10-08</w:t>
+            </w:r>
+          </w:p>
+        </w:tc>
+        <w:tc>
+          <w:tcPr/>
+          <w:p>
+            <w:pPr>
+              <w:pStyle w:val="Compact"/>
+              <w:jc w:val="left"/>
+            </w:pPr>
+            <w:r>
+              <w:t xml:space="preserve">My phone playtest, and fixes for off-script typing and the look-back</w:t>
+            </w:r>
+          </w:p>
+        </w:tc>
+      </w:tr>
+      <w:tr>
+        <w:tc>
+          <w:tcPr/>
+          <w:p>
+            <w:pPr>
+              <w:pStyle w:val="Compact"/>
+              <w:jc w:val="left"/>
+            </w:pPr>
+            <w:r>
+              <w:t xml:space="preserve">10-08</w:t>
+            </w:r>
+          </w:p>
+        </w:tc>
+        <w:tc>
+          <w:tcPr/>
+          <w:p>
+            <w:pPr>
+              <w:pStyle w:val="Compact"/>
+              <w:jc w:val="left"/>
+            </w:pPr>
+            <w:r>
+              <w:t xml:space="preserve">Juno talking to an empty room: one line, then wait</w:t>
+            </w:r>
+          </w:p>
+        </w:tc>
+      </w:tr>
+      <w:tr>
+        <w:tc>
+          <w:tcPr/>
+          <w:p>
+            <w:pPr>
+              <w:pStyle w:val="Compact"/>
+              <w:jc w:val="left"/>
+            </w:pPr>
+            <w:r>
+              <w:t xml:space="preserve">10-08</w:t>
+            </w:r>
+          </w:p>
+        </w:tc>
+        <w:tc>
+          <w:tcPr/>
+          <w:p>
+            <w:pPr>
+              <w:pStyle w:val="Compact"/>
+              <w:jc w:val="left"/>
+            </w:pPr>
+            <w:r>
+              <w:t xml:space="preserve">Pacing between Juno’s lines, and a banner for Rachel’s reply</w:t>
+            </w:r>
+          </w:p>
+        </w:tc>
+      </w:tr>
+      <w:tr>
+        <w:tc>
+          <w:tcPr/>
+          <w:p>
+            <w:pPr>
+              <w:pStyle w:val="Compact"/>
+              <w:jc w:val="left"/>
+            </w:pPr>
+            <w:r>
+              <w:t xml:space="preserve">10-08</w:t>
+            </w:r>
+          </w:p>
+        </w:tc>
+        <w:tc>
+          <w:tcPr/>
+          <w:p>
+            <w:pPr>
+              <w:pStyle w:val="Compact"/>
+              <w:jc w:val="left"/>
+            </w:pPr>
+            <w:r>
+              <w:t xml:space="preserve">Making the opening and the evidence mechanic understandable</w:t>
+            </w:r>
+          </w:p>
+        </w:tc>
+      </w:tr>
+      <w:tr>
+        <w:tc>
+          <w:tcPr/>
+          <w:p>
+            <w:pPr>
+              <w:pStyle w:val="Compact"/>
+              <w:jc w:val="left"/>
+            </w:pPr>
+            <w:r>
+              <w:t xml:space="preserve">10-10</w:t>
+            </w:r>
+          </w:p>
+        </w:tc>
+        <w:tc>
+          <w:tcPr/>
+          <w:p>
+            <w:pPr>
+              <w:pStyle w:val="Compact"/>
+              <w:jc w:val="left"/>
+            </w:pPr>
+            <w:r>
+              <w:t xml:space="preserve">Splitting the phone from the game: the notebook layer</w:t>
+            </w:r>
+          </w:p>
+        </w:tc>
+      </w:tr>
+      <w:tr>
+        <w:tc>
+          <w:tcPr/>
+          <w:p>
+            <w:pPr>
+              <w:pStyle w:val="Compact"/>
+              <w:jc w:val="left"/>
+            </w:pPr>
+            <w:r>
+              <w:t xml:space="preserve">10-10</w:t>
+            </w:r>
+          </w:p>
+        </w:tc>
+        <w:tc>
+          <w:tcPr/>
+          <w:p>
+            <w:pPr>
+              <w:pStyle w:val="Compact"/>
+              <w:jc w:val="left"/>
+            </w:pPr>
+            <w:r>
+              <w:t xml:space="preserve">Home screen + Notes app instead of the notebook; fixing the bounce</w:t>
+            </w:r>
+          </w:p>
+        </w:tc>
+      </w:tr>
+      <w:tr>
+        <w:tc>
+          <w:tcPr/>
+          <w:p>
+            <w:pPr>
+              <w:pStyle w:val="Compact"/>
+              <w:jc w:val="left"/>
+            </w:pPr>
+            <w:r>
+              <w:t xml:space="preserve">10-10</w:t>
+            </w:r>
+          </w:p>
+        </w:tc>
+        <w:tc>
+          <w:tcPr/>
+          <w:p>
+            <w:pPr>
+              <w:pStyle w:val="Compact"/>
+              <w:jc w:val="left"/>
+            </w:pPr>
+            <w:r>
+              <w:t xml:space="preserve">The look-back question:</w:t>
+            </w:r>
+            <w:r>
+              <w:t xml:space="preserve"> </w:t>
+            </w:r>
+            <w:r>
+              <w:t xml:space="preserve">“</w:t>
+            </w:r>
+            <w:r>
+              <w:t xml:space="preserve">did you believe it?</w:t>
+            </w:r>
+            <w:r>
+              <w:t xml:space="preserve">”</w:t>
+            </w:r>
+          </w:p>
+        </w:tc>
+      </w:tr>
+      <w:tr>
+        <w:tc>
+          <w:tcPr/>
+          <w:p>
+            <w:pPr>
+              <w:pStyle w:val="Compact"/>
+              <w:jc w:val="left"/>
+            </w:pPr>
+            <w:r>
+              <w:t xml:space="preserve">10-12</w:t>
+            </w:r>
+          </w:p>
+        </w:tc>
+        <w:tc>
+          <w:tcPr/>
+          <w:p>
+            <w:pPr>
+              <w:pStyle w:val="Compact"/>
+              <w:jc w:val="left"/>
+            </w:pPr>
+            <w:r>
+              <w:t xml:space="preserve">Clarity pass: premise, goal, clue 3 as the ending</w:t>
+            </w:r>
+          </w:p>
+        </w:tc>
+      </w:tr>
+      <w:tr>
+        <w:tc>
+          <w:tcPr/>
+          <w:p>
+            <w:pPr>
+              <w:pStyle w:val="Compact"/>
+              <w:jc w:val="left"/>
+            </w:pPr>
+            <w:r>
+              <w:t xml:space="preserve">10-12</w:t>
+            </w:r>
+          </w:p>
+        </w:tc>
+        <w:tc>
+          <w:tcPr/>
+          <w:p>
+            <w:pPr>
+              <w:pStyle w:val="Compact"/>
+              <w:jc w:val="left"/>
+            </w:pPr>
+            <w:r>
+              <w:t xml:space="preserve">Fixes from a written playtest critique</w:t>
+            </w:r>
+          </w:p>
+        </w:tc>
+      </w:tr>
+      <w:tr>
+        <w:tc>
+          <w:tcPr/>
+          <w:p>
+            <w:pPr>
+              <w:pStyle w:val="Compact"/>
+              <w:jc w:val="left"/>
+            </w:pPr>
+            <w:r>
+              <w:t xml:space="preserve">10-12</w:t>
+            </w:r>
+          </w:p>
+        </w:tc>
+        <w:tc>
+          <w:tcPr/>
+          <w:p>
+            <w:pPr>
+              <w:pStyle w:val="Compact"/>
+              <w:jc w:val="left"/>
+            </w:pPr>
+            <w:r>
+              <w:t xml:space="preserve">Rewriting lines so the player finds it themselves</w:t>
+            </w:r>
+          </w:p>
+        </w:tc>
+      </w:tr>
+      <w:tr>
+        <w:tc>
+          <w:tcPr/>
+          <w:p>
+            <w:pPr>
+              <w:pStyle w:val="Compact"/>
+              <w:jc w:val="left"/>
+            </w:pPr>
+            <w:r>
+              <w:t xml:space="preserve">10-12</w:t>
+            </w:r>
+          </w:p>
+        </w:tc>
+        <w:tc>
+          <w:tcPr/>
+          <w:p>
+            <w:pPr>
+              <w:pStyle w:val="Compact"/>
+              <w:jc w:val="left"/>
+            </w:pPr>
+            <w:r>
+              <w:t xml:space="preserve">Banner shaking; no detour through Notes for Rachel’s reply</w:t>
+            </w:r>
+          </w:p>
+        </w:tc>
+      </w:tr>
+      <w:tr>
+        <w:tc>
+          <w:tcPr/>
+          <w:p>
+            <w:pPr>
+              <w:pStyle w:val="Compact"/>
+              <w:jc w:val="left"/>
+            </w:pPr>
+            <w:r>
+              <w:t xml:space="preserve">10-12</w:t>
+            </w:r>
+          </w:p>
+        </w:tc>
+        <w:tc>
+          <w:tcPr/>
+          <w:p>
+            <w:pPr>
+              <w:pStyle w:val="Compact"/>
+              <w:jc w:val="left"/>
+            </w:pPr>
+            <w:r>
+              <w:t xml:space="preserve">Making it look like a real phone (part one: fidelity, not style)</w:t>
+            </w:r>
+          </w:p>
+        </w:tc>
+      </w:tr>
+      <w:tr>
+        <w:tc>
+          <w:tcPr/>
+          <w:p>
+            <w:pPr>
+              <w:pStyle w:val="Compact"/>
+              <w:jc w:val="left"/>
+            </w:pPr>
+            <w:r>
+              <w:t xml:space="preserve">10-12</w:t>
+            </w:r>
+          </w:p>
+        </w:tc>
+        <w:tc>
+          <w:tcPr/>
+          <w:p>
+            <w:pPr>
+              <w:pStyle w:val="Compact"/>
+              <w:jc w:val="left"/>
+            </w:pPr>
+            <w:r>
+              <w:t xml:space="preserve">Notes: from free pairing to questions</w:t>
+            </w:r>
+          </w:p>
+        </w:tc>
+      </w:tr>
+      <w:tr>
+        <w:tc>
+          <w:tcPr/>
+          <w:p>
+            <w:pPr>
+              <w:pStyle w:val="Compact"/>
+              <w:jc w:val="left"/>
+            </w:pPr>
+            <w:r>
+              <w:t xml:space="preserve">10-12</w:t>
+            </w:r>
+          </w:p>
+        </w:tc>
+        <w:tc>
+          <w:tcPr/>
+          <w:p>
+            <w:pPr>
+              <w:pStyle w:val="Compact"/>
+              <w:jc w:val="left"/>
+            </w:pPr>
+            <w:r>
+              <w:t xml:space="preserve">“</w:t>
+            </w:r>
+            <w:r>
+              <w:t xml:space="preserve">Tonight</w:t>
+            </w:r>
+            <w:r>
+              <w:t xml:space="preserve">”</w:t>
+            </w:r>
+            <w:r>
+              <w:t xml:space="preserve"> </w:t>
+            </w:r>
+            <w:r>
+              <w:t xml:space="preserve">rebuilt as a replay, with a last choice</w:t>
+            </w:r>
+          </w:p>
+        </w:tc>
+      </w:tr>
+      <w:tr>
+        <w:tc>
+          <w:tcPr/>
+          <w:p>
+            <w:pPr>
+              <w:pStyle w:val="Compact"/>
+              <w:jc w:val="left"/>
+            </w:pPr>
+            <w:r>
+              <w:t xml:space="preserve">10-13</w:t>
+            </w:r>
+          </w:p>
+        </w:tc>
+        <w:tc>
+          <w:tcPr/>
+          <w:p>
+            <w:pPr>
+              <w:pStyle w:val="Compact"/>
+              <w:jc w:val="left"/>
+            </w:pPr>
+            <w:r>
+              <w:t xml:space="preserve">Immersion: a new opening, the player’s name,</w:t>
+            </w:r>
+            <w:r>
+              <w:t xml:space="preserve"> </w:t>
+            </w:r>
+            <w:r>
+              <w:t xml:space="preserve">“</w:t>
+            </w:r>
+            <w:r>
+              <w:t xml:space="preserve">Not Delivered</w:t>
+            </w:r>
+            <w:r>
+              <w:t xml:space="preserve">”</w:t>
+            </w:r>
+            <w:r>
+              <w:t xml:space="preserve">, faster pacing</w:t>
+            </w:r>
+          </w:p>
+        </w:tc>
+      </w:tr>
+      <w:tr>
+        <w:tc>
+          <w:tcPr/>
+          <w:p>
+            <w:pPr>
+              <w:pStyle w:val="Compact"/>
+              <w:jc w:val="left"/>
+            </w:pPr>
+            <w:r>
+              <w:t xml:space="preserve">10-13</w:t>
+            </w:r>
+          </w:p>
+        </w:tc>
+        <w:tc>
+          <w:tcPr/>
+          <w:p>
+            <w:pPr>
+              <w:pStyle w:val="Compact"/>
+              <w:jc w:val="left"/>
+            </w:pPr>
+            <w:r>
+              <w:t xml:space="preserve">Night pass: a visual system, game feel, sound</w:t>
+            </w:r>
+          </w:p>
+        </w:tc>
+      </w:tr>
+      <w:tr>
+        <w:tc>
+          <w:tcPr/>
+          <w:p>
+            <w:pPr>
+              <w:pStyle w:val="Compact"/>
+              <w:jc w:val="left"/>
+            </w:pPr>
+            <w:r>
+              <w:t xml:space="preserve">10-13</w:t>
+            </w:r>
+          </w:p>
+        </w:tc>
+        <w:tc>
+          <w:tcPr/>
+          <w:p>
+            <w:pPr>
+              <w:pStyle w:val="Compact"/>
+              <w:jc w:val="left"/>
+            </w:pPr>
+            <w:r>
+              <w:t xml:space="preserve">Real photos for Rachel</w:t>
+            </w:r>
+          </w:p>
+        </w:tc>
+      </w:tr>
+      <w:tr>
+        <w:tc>
+          <w:tcPr/>
+          <w:p>
+            <w:pPr>
+              <w:pStyle w:val="Compact"/>
+              <w:jc w:val="left"/>
+            </w:pPr>
+            <w:r>
+              <w:t xml:space="preserve">10-13</w:t>
+            </w:r>
+          </w:p>
+        </w:tc>
+        <w:tc>
+          <w:tcPr/>
+          <w:p>
+            <w:pPr>
+              <w:pStyle w:val="Compact"/>
+              <w:jc w:val="left"/>
+            </w:pPr>
+            <w:r>
+              <w:t xml:space="preserve">Wallpaper</w:t>
+            </w:r>
+          </w:p>
+        </w:tc>
+      </w:tr>
+      <w:tr>
+        <w:tc>
+          <w:tcPr/>
+          <w:p>
+            <w:pPr>
+              <w:pStyle w:val="Compact"/>
+              <w:jc w:val="left"/>
+            </w:pPr>
+            <w:r>
+              <w:t xml:space="preserve">10-13</w:t>
+            </w:r>
+          </w:p>
+        </w:tc>
+        <w:tc>
+          <w:tcPr/>
+          <w:p>
+            <w:pPr>
+              <w:pStyle w:val="Compact"/>
+              <w:jc w:val="left"/>
+            </w:pPr>
+            <w:r>
+              <w:t xml:space="preserve">Fixing what a full playthrough exposed</w:t>
+            </w:r>
+          </w:p>
+        </w:tc>
+      </w:tr>
+      <w:tr>
+        <w:tc>
+          <w:tcPr/>
+          <w:p>
+            <w:pPr>
+              <w:pStyle w:val="Compact"/>
+              <w:jc w:val="left"/>
+            </w:pPr>
+            <w:r>
+              <w:t xml:space="preserve">10-13</w:t>
+            </w:r>
+          </w:p>
+        </w:tc>
+        <w:tc>
+          <w:tcPr/>
+          <w:p>
+            <w:pPr>
+              <w:pStyle w:val="Compact"/>
+              <w:jc w:val="left"/>
+            </w:pPr>
+            <w:r>
+              <w:t xml:space="preserve">Start page: one line removed</w:t>
+            </w:r>
+          </w:p>
+        </w:tc>
+      </w:tr>
+      <w:tr>
+        <w:tc>
+          <w:tcPr/>
+          <w:p>
+            <w:pPr>
+              <w:pStyle w:val="Compact"/>
+              <w:jc w:val="left"/>
+            </w:pPr>
+            <w:r>
+              <w:t xml:space="preserve">10-13</w:t>
+            </w:r>
+          </w:p>
+        </w:tc>
+        <w:tc>
+          <w:tcPr/>
+          <w:p>
+            <w:pPr>
+              <w:pStyle w:val="Compact"/>
+              <w:jc w:val="left"/>
+            </w:pPr>
+            <w:r>
+              <w:t xml:space="preserve">Context for the player: who Juno is, why they’re here</w:t>
+            </w:r>
+          </w:p>
+        </w:tc>
+      </w:tr>
+      <w:tr>
+        <w:tc>
+          <w:tcPr/>
+          <w:p>
+            <w:pPr>
+              <w:pStyle w:val="Compact"/>
+              <w:jc w:val="left"/>
+            </w:pPr>
+            <w:r>
+              <w:t xml:space="preserve">10-13</w:t>
+            </w:r>
+          </w:p>
+        </w:tc>
+        <w:tc>
+          <w:tcPr/>
+          <w:p>
+            <w:pPr>
+              <w:pStyle w:val="Compact"/>
+              <w:jc w:val="left"/>
+            </w:pPr>
+            <w:r>
+              <w:t xml:space="preserve">Fixes from a full playthrough with the new start page</w:t>
+            </w:r>
+          </w:p>
+        </w:tc>
+      </w:tr>
+      <w:tr>
+        <w:tc>
+          <w:tcPr/>
+          <w:p>
+            <w:pPr>
+              <w:pStyle w:val="Compact"/>
+              <w:jc w:val="left"/>
+            </w:pPr>
+            <w:r>
+              <w:t xml:space="preserve">10-13</w:t>
+            </w:r>
+          </w:p>
+        </w:tc>
+        <w:tc>
+          <w:tcPr/>
+          <w:p>
+            <w:pPr>
+              <w:pStyle w:val="Compact"/>
+              <w:jc w:val="left"/>
+            </w:pPr>
+            <w:r>
+              <w:t xml:space="preserve">Start page in two screens</w:t>
+            </w:r>
+          </w:p>
+        </w:tc>
+      </w:tr>
+      <w:tr>
+        <w:tc>
+          <w:tcPr/>
+          <w:p>
+            <w:pPr>
+              <w:pStyle w:val="Compact"/>
+              <w:jc w:val="left"/>
+            </w:pPr>
+            <w:r>
+              <w:t xml:space="preserve">10-13</w:t>
+            </w:r>
+          </w:p>
+        </w:tc>
+        <w:tc>
+          <w:tcPr/>
+          <w:p>
+            <w:pPr>
+              <w:pStyle w:val="Compact"/>
+              <w:jc w:val="left"/>
+            </w:pPr>
+            <w:r>
+              <w:t xml:space="preserve">A choice inside Rachel’s old messages</w:t>
+            </w:r>
+          </w:p>
+        </w:tc>
+      </w:tr>
+      <w:tr>
+        <w:tc>
+          <w:tcPr/>
+          <w:p>
+            <w:pPr>
+              <w:pStyle w:val="Compact"/>
+              <w:jc w:val="left"/>
+            </w:pPr>
+            <w:r>
+              <w:t xml:space="preserve">10-14</w:t>
+            </w:r>
+          </w:p>
+        </w:tc>
+        <w:tc>
+          <w:tcPr/>
+          <w:p>
+            <w:pPr>
+              <w:pStyle w:val="Compact"/>
+              <w:jc w:val="left"/>
+            </w:pPr>
+            <w:r>
+              <w:t xml:space="preserve">Investigating rebuilt: screenshots, showing Juno, freer play</w:t>
+            </w:r>
+          </w:p>
+        </w:tc>
+      </w:tr>
+      <w:tr>
+        <w:tc>
+          <w:tcPr/>
+          <w:p>
+            <w:pPr>
+              <w:pStyle w:val="Compact"/>
+              <w:jc w:val="left"/>
+            </w:pPr>
+            <w:r>
+              <w:t xml:space="preserve">10-14</w:t>
+            </w:r>
+          </w:p>
+        </w:tc>
+        <w:tc>
+          <w:tcPr/>
+          <w:p>
+            <w:pPr>
+              <w:pStyle w:val="Compact"/>
+              <w:jc w:val="left"/>
+            </w:pPr>
+            <w:r>
+              <w:t xml:space="preserve">Screenshots easier to see, the story teaches them, Photos as a real camera roll</w:t>
+            </w:r>
+          </w:p>
+        </w:tc>
+      </w:tr>
+      <w:tr>
+        <w:tc>
+          <w:tcPr/>
+          <w:p>
+            <w:pPr>
+              <w:pStyle w:val="Compact"/>
+              <w:jc w:val="left"/>
+            </w:pPr>
+            <w:r>
+              <w:t xml:space="preserve">10-14</w:t>
+            </w:r>
+          </w:p>
+        </w:tc>
+        <w:tc>
+          <w:tcPr/>
+          <w:p>
+            <w:pPr>
+              <w:pStyle w:val="Compact"/>
+              <w:jc w:val="left"/>
+            </w:pPr>
+            <w:r>
+              <w:t xml:space="preserve">The first screenshot, taught when the story needs it</w:t>
+            </w:r>
+          </w:p>
+        </w:tc>
+      </w:tr>
+      <w:tr>
+        <w:tc>
+          <w:tcPr/>
+          <w:p>
+            <w:pPr>
+              <w:pStyle w:val="Compact"/>
+              <w:jc w:val="left"/>
+            </w:pPr>
+            <w:r>
+              <w:t xml:space="preserve">10-14</w:t>
+            </w:r>
+          </w:p>
+        </w:tc>
+        <w:tc>
+          <w:tcPr/>
+          <w:p>
+            <w:pPr>
+              <w:pStyle w:val="Compact"/>
+              <w:jc w:val="left"/>
+            </w:pPr>
+            <w:r>
+              <w:t xml:space="preserve">Switchable model for Juno, and a comparison page</w:t>
+            </w:r>
+          </w:p>
+        </w:tc>
+      </w:tr>
+      <w:tr>
+        <w:tc>
+          <w:tcPr/>
+          <w:p>
+            <w:pPr>
+              <w:pStyle w:val="Compact"/>
+              <w:jc w:val="left"/>
+            </w:pPr>
+            <w:r>
+              <w:t xml:space="preserve">10-14</w:t>
+            </w:r>
+          </w:p>
+        </w:tc>
+        <w:tc>
+          <w:tcPr/>
+          <w:p>
+            <w:pPr>
+              <w:pStyle w:val="Compact"/>
+              <w:jc w:val="left"/>
+            </w:pPr>
+            <w:r>
+              <w:t xml:space="preserve">Juno’s lines now come from Claude Haiku 5.5</w:t>
+            </w:r>
+          </w:p>
+        </w:tc>
+      </w:tr>
+      <w:tr>
+        <w:tc>
+          <w:tcPr/>
+          <w:p>
+            <w:pPr>
+              <w:pStyle w:val="Compact"/>
+              <w:jc w:val="left"/>
+            </w:pPr>
+            <w:r>
+              <w:t xml:space="preserve">10-14</w:t>
+            </w:r>
+          </w:p>
+        </w:tc>
+        <w:tc>
+          <w:tcPr/>
+          <w:p>
+            <w:pPr>
+              <w:pStyle w:val="Compact"/>
+              <w:jc w:val="left"/>
+            </w:pPr>
+            <w:r>
+              <w:t xml:space="preserve">Juno answers what the player actually types</w:t>
+            </w:r>
+          </w:p>
+        </w:tc>
+      </w:tr>
+      <w:tr>
+        <w:tc>
+          <w:tcPr/>
+          <w:p>
+            <w:pPr>
+              <w:pStyle w:val="Compact"/>
+              <w:jc w:val="left"/>
+            </w:pPr>
+            <w:r>
+              <w:t xml:space="preserve">10-14</w:t>
+            </w:r>
+          </w:p>
+        </w:tc>
+        <w:tc>
+          <w:tcPr/>
+          <w:p>
+            <w:pPr>
+              <w:pStyle w:val="Compact"/>
+              <w:jc w:val="left"/>
+            </w:pPr>
+            <w:r>
+              <w:t xml:space="preserve">Juno doesn’t go along with things the player makes up</w:t>
+            </w:r>
+          </w:p>
+        </w:tc>
+      </w:tr>
+      <w:tr>
+        <w:tc>
+          <w:tcPr/>
+          <w:p>
+            <w:pPr>
+              <w:pStyle w:val="Compact"/>
+              <w:jc w:val="left"/>
+            </w:pPr>
+            <w:r>
+              <w:t xml:space="preserve">10-14</w:t>
+            </w:r>
+          </w:p>
+        </w:tc>
+        <w:tc>
+          <w:tcPr/>
+          <w:p>
+            <w:pPr>
+              <w:pStyle w:val="Compact"/>
+              <w:jc w:val="left"/>
+            </w:pPr>
+            <w:r>
+              <w:t xml:space="preserve">A help note for real danger, and fallbacks that don’t repeat</w:t>
+            </w:r>
+          </w:p>
+        </w:tc>
+      </w:tr>
+      <w:tr>
+        <w:tc>
+          <w:tcPr/>
+          <w:p>
+            <w:pPr>
+              <w:pStyle w:val="Compact"/>
+              <w:jc w:val="left"/>
+            </w:pPr>
+            <w:r>
+              <w:t xml:space="preserve">10-14</w:t>
+            </w:r>
+          </w:p>
+        </w:tc>
+        <w:tc>
+          <w:tcPr/>
+          <w:p>
+            <w:pPr>
+              <w:pStyle w:val="Compact"/>
+              <w:jc w:val="left"/>
+            </w:pPr>
+            <w:r>
+              <w:t xml:space="preserve">The night as a resource: battery, the 00:40 erase, the phone dying</w:t>
+            </w:r>
+          </w:p>
+        </w:tc>
+      </w:tr>
+      <w:tr>
+        <w:tc>
+          <w:tcPr/>
+          <w:p>
+            <w:pPr>
+              <w:pStyle w:val="Compact"/>
+              <w:jc w:val="left"/>
+            </w:pPr>
+            <w:r>
+              <w:t xml:space="preserve">10-14</w:t>
+            </w:r>
+          </w:p>
+        </w:tc>
+        <w:tc>
+          <w:tcPr/>
+          <w:p>
+            <w:pPr>
+              <w:pStyle w:val="Compact"/>
+              <w:jc w:val="left"/>
+            </w:pPr>
+            <w:r>
+              <w:t xml:space="preserve">Making the night visible, and telling the player</w:t>
+            </w:r>
+          </w:p>
+        </w:tc>
+      </w:tr>
+      <w:tr>
+        <w:tc>
+          <w:tcPr/>
+          <w:p>
+            <w:pPr>
+              <w:pStyle w:val="Compact"/>
+              <w:jc w:val="left"/>
+            </w:pPr>
+            <w:r>
+              <w:t xml:space="preserve">10-14</w:t>
+            </w:r>
+          </w:p>
+        </w:tc>
+        <w:tc>
+          <w:tcPr/>
+          <w:p>
+            <w:pPr>
+              <w:pStyle w:val="Compact"/>
+              <w:jc w:val="left"/>
+            </w:pPr>
+            <w:r>
+              <w:t xml:space="preserve">Notifications no longer cover the top bar</w:t>
+            </w:r>
+          </w:p>
+        </w:tc>
+      </w:tr>
+      <w:tr>
+        <w:tc>
+          <w:tcPr/>
+          <w:p>
+            <w:pPr>
+              <w:pStyle w:val="Compact"/>
+              <w:jc w:val="left"/>
+            </w:pPr>
+            <w:r>
+              <w:t xml:space="preserve">10-14</w:t>
+            </w:r>
+          </w:p>
+        </w:tc>
+        <w:tc>
+          <w:tcPr/>
+          <w:p>
+            <w:pPr>
+              <w:pStyle w:val="Compact"/>
+              <w:jc w:val="left"/>
+            </w:pPr>
+            <w:r>
+              <w:t xml:space="preserve">Midterm presentation draft</w:t>
+            </w:r>
+          </w:p>
+        </w:tc>
+      </w:tr>
+      <w:tr>
+        <w:tc>
+          <w:tcPr/>
+          <w:p>
+            <w:pPr>
+              <w:pStyle w:val="Compact"/>
+              <w:jc w:val="left"/>
+            </w:pPr>
+            <w:r>
+              <w:t xml:space="preserve">10-14</w:t>
+            </w:r>
+          </w:p>
+        </w:tc>
+        <w:tc>
+          <w:tcPr/>
+          <w:p>
+            <w:pPr>
+              <w:pStyle w:val="Compact"/>
+              <w:jc w:val="left"/>
+            </w:pPr>
+            <w:r>
+              <w:t xml:space="preserve">Presentation draft revised around the new theme</w:t>
+            </w:r>
+          </w:p>
+        </w:tc>
+      </w:tr>
+      <w:tr>
+        <w:tc>
+          <w:tcPr/>
+          <w:p>
+            <w:pPr>
+              <w:pStyle w:val="Compact"/>
+              <w:jc w:val="left"/>
+            </w:pPr>
+            <w:r>
+              <w:t xml:space="preserve">10-14</w:t>
+            </w:r>
+          </w:p>
+        </w:tc>
+        <w:tc>
+          <w:tcPr/>
+          <w:p>
+            <w:pPr>
+              <w:pStyle w:val="Compact"/>
+              <w:jc w:val="left"/>
+            </w:pPr>
+            <w:r>
+              <w:t xml:space="preserve">Review and edits of my midterm slides</w:t>
+            </w:r>
+          </w:p>
+        </w:tc>
+      </w:tr>
+      <w:tr>
+        <w:tc>
+          <w:tcPr/>
+          <w:p>
+            <w:pPr>
+              <w:pStyle w:val="Compact"/>
+              <w:jc w:val="left"/>
+            </w:pPr>
+            <w:r>
+              <w:t xml:space="preserve">10-14</w:t>
+            </w:r>
+          </w:p>
+        </w:tc>
+        <w:tc>
+          <w:tcPr/>
+          <w:p>
+            <w:pPr>
+              <w:pStyle w:val="Compact"/>
+              <w:jc w:val="left"/>
+            </w:pPr>
+            <w:r>
+              <w:t xml:space="preserve">Midterm slides rebuilt: the project, how the demo plays, one slide per user-test problem, the full game</w:t>
+            </w:r>
+          </w:p>
+        </w:tc>
+      </w:tr>
+      <w:tr>
+        <w:tc>
+          <w:tcPr/>
+          <w:p>
+            <w:pPr>
+              <w:pStyle w:val="Compact"/>
+              <w:jc w:val="left"/>
+            </w:pPr>
+            <w:r>
+              <w:t xml:space="preserve">10-14</w:t>
+            </w:r>
+          </w:p>
+        </w:tc>
+        <w:tc>
+          <w:tcPr/>
+          <w:p>
+            <w:pPr>
+              <w:pStyle w:val="Compact"/>
+              <w:jc w:val="left"/>
+            </w:pPr>
+            <w:r>
+              <w:t xml:space="preserve">Slide: why I switched Juno’s model</w:t>
+            </w:r>
+          </w:p>
+        </w:tc>
+      </w:tr>
+      <w:tr>
+        <w:tc>
+          <w:tcPr/>
+          <w:p>
+            <w:pPr>
+              <w:pStyle w:val="Compact"/>
+              <w:jc w:val="left"/>
+            </w:pPr>
+            <w:r>
+              <w:t xml:space="preserve">10-14</w:t>
+            </w:r>
+          </w:p>
+        </w:tc>
+        <w:tc>
+          <w:tcPr/>
+          <w:p>
+            <w:pPr>
+              <w:pStyle w:val="Compact"/>
+              <w:jc w:val="left"/>
+            </w:pPr>
+            <w:r>
+              <w:t xml:space="preserve">Slide: Notes and the paperclip as one problem</w:t>
+            </w:r>
+          </w:p>
+        </w:tc>
+      </w:tr>
+      <w:tr>
+        <w:tc>
+          <w:tcPr/>
+          <w:p>
+            <w:pPr>
+              <w:pStyle w:val="Compact"/>
+              <w:jc w:val="left"/>
+            </w:pPr>
+            <w:r>
+              <w:t xml:space="preserve">10-14</w:t>
+            </w:r>
+          </w:p>
+        </w:tc>
+        <w:tc>
+          <w:tcPr/>
+          <w:p>
+            <w:pPr>
+              <w:pStyle w:val="Compact"/>
+              <w:jc w:val="left"/>
+            </w:pPr>
+            <w:r>
+              <w:t xml:space="preserve">Slide:</w:t>
+            </w:r>
+            <w:r>
+              <w:t xml:space="preserve"> </w:t>
+            </w:r>
+            <w:r>
+              <w:t xml:space="preserve">“</w:t>
+            </w:r>
+            <w:r>
+              <w:t xml:space="preserve">Where this started</w:t>
+            </w:r>
+            <w:r>
+              <w:t xml:space="preserve">”</w:t>
+            </w:r>
+            <w:r>
+              <w:t xml:space="preserve"> </w:t>
+            </w:r>
+            <w:r>
+              <w:t xml:space="preserve">redone</w:t>
+            </w:r>
+          </w:p>
+        </w:tc>
+      </w:tr>
+      <w:tr>
+        <w:tc>
+          <w:tcPr/>
+          <w:p>
+            <w:pPr>
+              <w:pStyle w:val="Compact"/>
+              <w:jc w:val="left"/>
+            </w:pPr>
+            <w:r>
+              <w:t xml:space="preserve">10-14</w:t>
+            </w:r>
+          </w:p>
+        </w:tc>
+        <w:tc>
+          <w:tcPr/>
+          <w:p>
+            <w:pPr>
+              <w:pStyle w:val="Compact"/>
+              <w:jc w:val="left"/>
+            </w:pPr>
+            <w:r>
+              <w:t xml:space="preserve">Opening slide checked against the paper itself</w:t>
+            </w:r>
+          </w:p>
+        </w:tc>
+      </w:tr>
+      <w:tr>
+        <w:tc>
+          <w:tcPr/>
+          <w:p>
+            <w:pPr>
+              <w:pStyle w:val="Compact"/>
+              <w:jc w:val="left"/>
+            </w:pPr>
+            <w:r>
+              <w:t xml:space="preserve">10-14</w:t>
+            </w:r>
+          </w:p>
+        </w:tc>
+        <w:tc>
+          <w:tcPr/>
+          <w:p>
+            <w:pPr>
+              <w:pStyle w:val="Compact"/>
+              <w:jc w:val="left"/>
+            </w:pPr>
+            <w:r>
+              <w:t xml:space="preserve">Slide 3 rebuilt with the paper’s own passages</w:t>
+            </w:r>
+          </w:p>
+        </w:tc>
+      </w:tr>
+      <w:tr>
+        <w:tc>
+          <w:tcPr/>
+          <w:p>
+            <w:pPr>
+              <w:pStyle w:val="Compact"/>
+              <w:jc w:val="left"/>
+            </w:pPr>
+            <w:r>
+              <w:t xml:space="preserve">10-14</w:t>
+            </w:r>
+          </w:p>
+        </w:tc>
+        <w:tc>
+          <w:tcPr/>
+          <w:p>
+            <w:pPr>
+              <w:pStyle w:val="Compact"/>
+              <w:jc w:val="left"/>
+            </w:pPr>
+            <w:r>
+              <w:t xml:space="preserve">Title slide and</w:t>
+            </w:r>
+            <w:r>
+              <w:t xml:space="preserve"> </w:t>
+            </w:r>
+            <w:r>
+              <w:t xml:space="preserve">“</w:t>
+            </w:r>
+            <w:r>
+              <w:t xml:space="preserve">What the game is</w:t>
+            </w:r>
+            <w:r>
+              <w:t xml:space="preserve">”</w:t>
+            </w:r>
+            <w:r>
+              <w:t xml:space="preserve"> </w:t>
+            </w:r>
+            <w:r>
+              <w:t xml:space="preserve">made concrete</w:t>
+            </w:r>
+          </w:p>
+        </w:tc>
+      </w:tr>
+      <w:tr>
+        <w:tc>
+          <w:tcPr/>
+          <w:p>
+            <w:pPr>
+              <w:pStyle w:val="Compact"/>
+              <w:jc w:val="left"/>
+            </w:pPr>
+            <w:r>
+              <w:t xml:space="preserve">10-14</w:t>
+            </w:r>
+          </w:p>
+        </w:tc>
+        <w:tc>
+          <w:tcPr/>
+          <w:p>
+            <w:pPr>
+              <w:pStyle w:val="Compact"/>
+              <w:jc w:val="left"/>
+            </w:pPr>
+            <w:r>
+              <w:t xml:space="preserve">“</w:t>
+            </w:r>
+            <w:r>
+              <w:t xml:space="preserve">What the game is</w:t>
+            </w:r>
+            <w:r>
+              <w:t xml:space="preserve">”</w:t>
+            </w:r>
+            <w:r>
+              <w:t xml:space="preserve"> </w:t>
+            </w:r>
+            <w:r>
+              <w:t xml:space="preserve">and</w:t>
+            </w:r>
+            <w:r>
+              <w:t xml:space="preserve"> </w:t>
+            </w:r>
+            <w:r>
+              <w:t xml:space="preserve">“</w:t>
+            </w:r>
+            <w:r>
+              <w:t xml:space="preserve">How you play</w:t>
+            </w:r>
+            <w:r>
+              <w:t xml:space="preserve">”</w:t>
+            </w:r>
+            <w:r>
+              <w:t xml:space="preserve">, split so they don’t repeat the user-test slides</w:t>
+            </w:r>
+          </w:p>
+        </w:tc>
+      </w:tr>
+      <w:tr>
+        <w:tc>
+          <w:tcPr/>
+          <w:p>
+            <w:pPr>
+              <w:pStyle w:val="Compact"/>
+              <w:jc w:val="left"/>
+            </w:pPr>
+            <w:r>
+              <w:t xml:space="preserve">10-14</w:t>
+            </w:r>
+          </w:p>
+        </w:tc>
+        <w:tc>
+          <w:tcPr/>
+          <w:p>
+            <w:pPr>
+              <w:pStyle w:val="Compact"/>
+              <w:jc w:val="left"/>
+            </w:pPr>
+            <w:r>
+              <w:t xml:space="preserve">Concept statement slide from my own statement</w:t>
+            </w:r>
+          </w:p>
+        </w:tc>
+      </w:tr>
+      <w:tr>
+        <w:tc>
+          <w:tcPr/>
+          <w:p>
+            <w:pPr>
+              <w:pStyle w:val="Compact"/>
+              <w:jc w:val="left"/>
+            </w:pPr>
+            <w:r>
+              <w:t xml:space="preserve">10-15</w:t>
+            </w:r>
+          </w:p>
+        </w:tc>
+        <w:tc>
+          <w:tcPr/>
+          <w:p>
+            <w:pPr>
+              <w:pStyle w:val="Compact"/>
+              <w:jc w:val="left"/>
+            </w:pPr>
+            <w:r>
+              <w:t xml:space="preserve">Research question on</w:t>
+            </w:r>
+            <w:r>
+              <w:t xml:space="preserve"> </w:t>
+            </w:r>
+            <w:r>
+              <w:t xml:space="preserve">“</w:t>
+            </w:r>
+            <w:r>
+              <w:t xml:space="preserve">What the game is</w:t>
+            </w:r>
+            <w:r>
+              <w:t xml:space="preserve">”</w:t>
+            </w:r>
+          </w:p>
+        </w:tc>
+      </w:tr>
+      <w:tr>
+        <w:tc>
+          <w:tcPr/>
+          <w:p>
+            <w:pPr>
+              <w:pStyle w:val="Compact"/>
+              <w:jc w:val="left"/>
+            </w:pPr>
+            <w:r>
+              <w:t xml:space="preserve">10-15</w:t>
+            </w:r>
+          </w:p>
+        </w:tc>
+        <w:tc>
+          <w:tcPr/>
+          <w:p>
+            <w:pPr>
+              <w:pStyle w:val="Compact"/>
+              <w:jc w:val="left"/>
+            </w:pPr>
+            <w:r>
+              <w:t xml:space="preserve">“</w:t>
+            </w:r>
+            <w:r>
+              <w:t xml:space="preserve">How you play</w:t>
+            </w:r>
+            <w:r>
+              <w:t xml:space="preserve">”</w:t>
+            </w:r>
+            <w:r>
+              <w:t xml:space="preserve">, complete</w:t>
+            </w:r>
+          </w:p>
+        </w:tc>
+      </w:tr>
+      <w:tr>
+        <w:tc>
+          <w:tcPr/>
+          <w:p>
+            <w:pPr>
+              <w:pStyle w:val="Compact"/>
+              <w:jc w:val="left"/>
+            </w:pPr>
+            <w:r>
+              <w:t xml:space="preserve">10-15</w:t>
+            </w:r>
+          </w:p>
+        </w:tc>
+        <w:tc>
+          <w:tcPr/>
+          <w:p>
+            <w:pPr>
+              <w:pStyle w:val="Compact"/>
+              <w:jc w:val="left"/>
+            </w:pPr>
+            <w:r>
+              <w:t xml:space="preserve">Presentation flow, and</w:t>
+            </w:r>
+            <w:r>
+              <w:t xml:space="preserve"> </w:t>
+            </w:r>
+            <w:r>
+              <w:t xml:space="preserve">“</w:t>
+            </w:r>
+            <w:r>
+              <w:t xml:space="preserve">How you play</w:t>
+            </w:r>
+            <w:r>
+              <w:t xml:space="preserve">”</w:t>
+            </w:r>
+            <w:r>
+              <w:t xml:space="preserve"> </w:t>
+            </w:r>
+            <w:r>
+              <w:t xml:space="preserve">as a screenshot map</w:t>
+            </w:r>
+          </w:p>
+        </w:tc>
+      </w:tr>
+      <w:tr>
+        <w:tc>
+          <w:tcPr/>
+          <w:p>
+            <w:pPr>
+              <w:pStyle w:val="Compact"/>
+              <w:jc w:val="left"/>
+            </w:pPr>
+            <w:r>
+              <w:t xml:space="preserve">10-15</w:t>
+            </w:r>
+          </w:p>
+        </w:tc>
+        <w:tc>
+          <w:tcPr/>
+          <w:p>
+            <w:pPr>
+              <w:pStyle w:val="Compact"/>
+              <w:jc w:val="left"/>
+            </w:pPr>
+            <w:r>
+              <w:t xml:space="preserve">Game structure: leaving changes the route, not the length</w:t>
+            </w:r>
+          </w:p>
+        </w:tc>
+      </w:tr>
+      <w:tr>
+        <w:tc>
+          <w:tcPr/>
+          <w:p>
+            <w:pPr>
+              <w:pStyle w:val="Compact"/>
+              <w:jc w:val="left"/>
+            </w:pPr>
+            <w:r>
+              <w:t xml:space="preserve">10-15</w:t>
+            </w:r>
+          </w:p>
+        </w:tc>
+        <w:tc>
+          <w:tcPr/>
+          <w:p>
+            <w:pPr>
+              <w:pStyle w:val="Compact"/>
+              <w:jc w:val="left"/>
+            </w:pPr>
+            <w:r>
+              <w:t xml:space="preserve">The full game’s structure, written into the story bible</w:t>
+            </w:r>
+          </w:p>
+        </w:tc>
+      </w:tr>
+      <w:tr>
+        <w:tc>
+          <w:tcPr/>
+          <w:p>
+            <w:pPr>
+              <w:pStyle w:val="Compact"/>
+              <w:jc w:val="left"/>
+            </w:pPr>
+            <w:r>
+              <w:t xml:space="preserve">10-15</w:t>
+            </w:r>
+          </w:p>
+        </w:tc>
+        <w:tc>
+          <w:tcPr/>
+          <w:p>
+            <w:pPr>
+              <w:pStyle w:val="Compact"/>
+              <w:jc w:val="left"/>
+            </w:pPr>
+            <w:r>
+              <w:t xml:space="preserve">Presentation:</w:t>
+            </w:r>
+            <w:r>
+              <w:t xml:space="preserve"> </w:t>
+            </w:r>
+            <w:r>
+              <w:t xml:space="preserve">“</w:t>
+            </w:r>
+            <w:r>
+              <w:t xml:space="preserve">Where this is going</w:t>
+            </w:r>
+            <w:r>
+              <w:t xml:space="preserve">”</w:t>
+            </w:r>
+            <w:r>
+              <w:t xml:space="preserve"> </w:t>
+            </w:r>
+            <w:r>
+              <w:t xml:space="preserve">slides rebuilt from the final structure</w:t>
+            </w:r>
+          </w:p>
+        </w:tc>
+      </w:tr>
+      <w:tr>
+        <w:tc>
+          <w:tcPr/>
+          <w:p>
+            <w:pPr>
+              <w:pStyle w:val="Compact"/>
+              <w:jc w:val="left"/>
+            </w:pPr>
+            <w:r>
+              <w:t xml:space="preserve">10-15</w:t>
+            </w:r>
+          </w:p>
+        </w:tc>
+        <w:tc>
+          <w:tcPr/>
+          <w:p>
+            <w:pPr>
+              <w:pStyle w:val="Compact"/>
+              <w:jc w:val="left"/>
+            </w:pPr>
+            <w:r>
+              <w:t xml:space="preserve">Midterm speaking script</w:t>
+            </w:r>
+          </w:p>
+        </w:tc>
+      </w:tr>
+      <w:tr>
+        <w:tc>
+          <w:tcPr/>
+          <w:p>
+            <w:pPr>
+              <w:pStyle w:val="Compact"/>
+              <w:jc w:val="left"/>
+            </w:pPr>
+            <w:r>
+              <w:t xml:space="preserve">10-15</w:t>
+            </w:r>
+          </w:p>
+        </w:tc>
+        <w:tc>
+          <w:tcPr/>
+          <w:p>
+            <w:pPr>
+              <w:pStyle w:val="Compact"/>
+              <w:jc w:val="left"/>
+            </w:pPr>
+            <w:r>
+              <w:t xml:space="preserve">Research question</w:t>
+            </w:r>
+          </w:p>
+        </w:tc>
+      </w:tr>
+      <w:tr>
+        <w:tc>
+          <w:tcPr/>
+          <w:p>
+            <w:pPr>
+              <w:pStyle w:val="Compact"/>
+              <w:jc w:val="left"/>
+            </w:pPr>
+            <w:r>
+              <w:t xml:space="preserve">10-22</w:t>
+            </w:r>
+          </w:p>
+        </w:tc>
+        <w:tc>
+          <w:tcPr/>
+          <w:p>
+            <w:pPr>
+              <w:pStyle w:val="Compact"/>
+              <w:jc w:val="left"/>
+            </w:pPr>
+            <w:r>
+              <w:t xml:space="preserve">Night 1 moved onto the final story</w:t>
+            </w:r>
+          </w:p>
+        </w:tc>
+      </w:tr>
+      <w:tr>
+        <w:tc>
+          <w:tcPr/>
+          <w:p>
+            <w:pPr>
+              <w:pStyle w:val="Compact"/>
+              <w:jc w:val="left"/>
+            </w:pPr>
+            <w:r>
+              <w:t xml:space="preserve">10-22</w:t>
+            </w:r>
+          </w:p>
+        </w:tc>
+        <w:tc>
+          <w:tcPr/>
+          <w:p>
+            <w:pPr>
+              <w:pStyle w:val="Compact"/>
+              <w:jc w:val="left"/>
+            </w:pPr>
+            <w:r>
+              <w:t xml:space="preserve">Tonight asks</w:t>
+            </w:r>
+            <w:r>
+              <w:t xml:space="preserve"> </w:t>
+            </w:r>
+            <w:r>
+              <w:t xml:space="preserve">“</w:t>
+            </w:r>
+            <w:r>
+              <w:t xml:space="preserve">What made you stay?</w:t>
+            </w:r>
+            <w:r>
+              <w:t xml:space="preserve">”</w:t>
+            </w:r>
+          </w:p>
+        </w:tc>
+      </w:tr>
+      <w:tr>
+        <w:tc>
+          <w:tcPr/>
+          <w:p>
+            <w:pPr>
+              <w:pStyle w:val="Compact"/>
+              <w:jc w:val="left"/>
+            </w:pPr>
+            <w:r>
+              <w:t xml:space="preserve">10-22</w:t>
+            </w:r>
+          </w:p>
+        </w:tc>
+        <w:tc>
+          <w:tcPr/>
+          <w:p>
+            <w:pPr>
+              <w:pStyle w:val="Compact"/>
+              <w:jc w:val="left"/>
+            </w:pPr>
+            <w:r>
+              <w:t xml:space="preserve">Landing and save system specs</w:t>
+            </w:r>
+          </w:p>
+        </w:tc>
+      </w:tr>
+      <w:tr>
+        <w:tc>
+          <w:tcPr/>
+          <w:p>
+            <w:pPr>
+              <w:pStyle w:val="Compact"/>
+              <w:jc w:val="left"/>
+            </w:pPr>
+            <w:r>
+              <w:t xml:space="preserve">10-24</w:t>
+            </w:r>
+          </w:p>
+        </w:tc>
+        <w:tc>
+          <w:tcPr/>
+          <w:p>
+            <w:pPr>
+              <w:pStyle w:val="Compact"/>
+              <w:jc w:val="left"/>
+            </w:pPr>
+            <w:r>
+              <w:t xml:space="preserve">Nights 1–3 restructured in the story bible</w:t>
+            </w:r>
+          </w:p>
+        </w:tc>
+      </w:tr>
+      <w:tr>
+        <w:tc>
+          <w:tcPr/>
+          <w:p>
+            <w:pPr>
+              <w:pStyle w:val="Compact"/>
+              <w:jc w:val="left"/>
+            </w:pPr>
+            <w:r>
+              <w:t xml:space="preserve">10-24</w:t>
+            </w:r>
+          </w:p>
+        </w:tc>
+        <w:tc>
+          <w:tcPr/>
+          <w:p>
+            <w:pPr>
+              <w:pStyle w:val="Compact"/>
+              <w:jc w:val="left"/>
+            </w:pPr>
+            <w:r>
+              <w:t xml:space="preserve">The first fake’s trigger, and a Night 1 scene table</w:t>
+            </w:r>
+          </w:p>
+        </w:tc>
+      </w:tr>
+      <w:tr>
+        <w:tc>
+          <w:tcPr/>
+          <w:p>
+            <w:pPr>
+              <w:pStyle w:val="Compact"/>
+              <w:jc w:val="left"/>
+            </w:pPr>
+            <w:r>
+              <w:t xml:space="preserve">10-24</w:t>
+            </w:r>
+          </w:p>
+        </w:tc>
+        <w:tc>
+          <w:tcPr/>
+          <w:p>
+            <w:pPr>
+              <w:pStyle w:val="Compact"/>
+              <w:jc w:val="left"/>
+            </w:pPr>
+            <w:r>
+              <w:t xml:space="preserve">The room</w:t>
+            </w:r>
+          </w:p>
+        </w:tc>
+      </w:tr>
+      <w:tr>
+        <w:tc>
+          <w:tcPr/>
+          <w:p>
+            <w:pPr>
+              <w:pStyle w:val="Compact"/>
+              <w:jc w:val="left"/>
+            </w:pPr>
+            <w:r>
+              <w:t xml:space="preserve">10-24</w:t>
+            </w:r>
+          </w:p>
+        </w:tc>
+        <w:tc>
+          <w:tcPr/>
+          <w:p>
+            <w:pPr>
+              <w:pStyle w:val="Compact"/>
+              <w:jc w:val="left"/>
+            </w:pPr>
+            <w:r>
+              <w:t xml:space="preserve">Waiting, the dead phone, End Session, how a night ends</w:t>
+            </w:r>
+          </w:p>
+        </w:tc>
+      </w:tr>
+      <w:tr>
+        <w:tc>
+          <w:tcPr/>
+          <w:p>
+            <w:pPr>
+              <w:pStyle w:val="Compact"/>
+              <w:jc w:val="left"/>
+            </w:pPr>
+            <w:r>
+              <w:t xml:space="preserve">10-24</w:t>
+            </w:r>
+          </w:p>
+        </w:tc>
+        <w:tc>
+          <w:tcPr/>
+          <w:p>
+            <w:pPr>
+              <w:pStyle w:val="Compact"/>
+              <w:jc w:val="left"/>
+            </w:pPr>
+            <w:r>
+              <w:t xml:space="preserve">Night 1 structure locked</w:t>
+            </w:r>
+          </w:p>
+        </w:tc>
+      </w:tr>
+      <w:tr>
+        <w:tc>
+          <w:tcPr/>
+          <w:p>
+            <w:pPr>
+              <w:pStyle w:val="Compact"/>
+              <w:jc w:val="left"/>
+            </w:pPr>
+            <w:r>
+              <w:t xml:space="preserve">10-24</w:t>
+            </w:r>
+          </w:p>
+        </w:tc>
+        <w:tc>
+          <w:tcPr/>
+          <w:p>
+            <w:pPr>
+              <w:pStyle w:val="Compact"/>
+              <w:jc w:val="left"/>
+            </w:pPr>
+            <w:r>
+              <w:t xml:space="preserve">“</w:t>
+            </w:r>
+            <w:r>
+              <w:t xml:space="preserve">Still unresolved</w:t>
+            </w:r>
+            <w:r>
+              <w:t xml:space="preserve">”</w:t>
+            </w:r>
+            <w:r>
+              <w:t xml:space="preserve"> </w:t>
+            </w:r>
+            <w:r>
+              <w:t xml:space="preserve">and costs</w:t>
+            </w:r>
+          </w:p>
+        </w:tc>
+      </w:tr>
+      <w:tr>
+        <w:tc>
+          <w:tcPr/>
+          <w:p>
+            <w:pPr>
+              <w:pStyle w:val="Compact"/>
+              <w:jc w:val="left"/>
+            </w:pPr>
+            <w:r>
+              <w:t xml:space="preserve">10-24</w:t>
+            </w:r>
+          </w:p>
+        </w:tc>
+        <w:tc>
+          <w:tcPr/>
+          <w:p>
+            <w:pPr>
+              <w:pStyle w:val="Compact"/>
+              <w:jc w:val="left"/>
+            </w:pPr>
+            <w:r>
+              <w:t xml:space="preserve">Night 2 scene table (draft)</w:t>
+            </w:r>
+          </w:p>
+        </w:tc>
+      </w:tr>
+      <w:tr>
+        <w:tc>
+          <w:tcPr/>
+          <w:p>
+            <w:pPr>
+              <w:pStyle w:val="Compact"/>
+              <w:jc w:val="left"/>
+            </w:pPr>
+            <w:r>
+              <w:t xml:space="preserve">10-24</w:t>
+            </w:r>
+          </w:p>
+        </w:tc>
+        <w:tc>
+          <w:tcPr/>
+          <w:p>
+            <w:pPr>
+              <w:pStyle w:val="Compact"/>
+              <w:jc w:val="left"/>
+            </w:pPr>
+            <w:r>
+              <w:t xml:space="preserve">Night 2: the removed thread, the link, Rachel’s note, the route choice</w:t>
+            </w:r>
+          </w:p>
+        </w:tc>
+      </w:tr>
+      <w:tr>
+        <w:tc>
+          <w:tcPr/>
+          <w:p>
+            <w:pPr>
+              <w:pStyle w:val="Compact"/>
+              <w:jc w:val="left"/>
+            </w:pPr>
+            <w:r>
+              <w:t xml:space="preserve">10-24</w:t>
+            </w:r>
+          </w:p>
+        </w:tc>
+        <w:tc>
+          <w:tcPr/>
+          <w:p>
+            <w:pPr>
+              <w:pStyle w:val="Compact"/>
+              <w:jc w:val="left"/>
+            </w:pPr>
+            <w:r>
+              <w:t xml:space="preserve">Three systems: Juno, Conversation Assist, Continuity</w:t>
+            </w:r>
+          </w:p>
+        </w:tc>
+      </w:tr>
+      <w:tr>
+        <w:tc>
+          <w:tcPr/>
+          <w:p>
+            <w:pPr>
+              <w:pStyle w:val="Compact"/>
+              <w:jc w:val="left"/>
+            </w:pPr>
+            <w:r>
+              <w:t xml:space="preserve">10-24</w:t>
+            </w:r>
+          </w:p>
+        </w:tc>
+        <w:tc>
+          <w:tcPr/>
+          <w:p>
+            <w:pPr>
+              <w:pStyle w:val="Compact"/>
+              <w:jc w:val="left"/>
+            </w:pPr>
+            <w:r>
+              <w:t xml:space="preserve">Continuity’s two modes, two records, Dani outside Orbit</w:t>
+            </w:r>
+          </w:p>
+        </w:tc>
+      </w:tr>
+      <w:tr>
+        <w:tc>
+          <w:tcPr/>
+          <w:p>
+            <w:pPr>
+              <w:pStyle w:val="Compact"/>
+              <w:jc w:val="left"/>
+            </w:pPr>
+            <w:r>
+              <w:t xml:space="preserve">10-24</w:t>
+            </w:r>
+          </w:p>
+        </w:tc>
+        <w:tc>
+          <w:tcPr/>
+          <w:p>
+            <w:pPr>
+              <w:pStyle w:val="Compact"/>
+              <w:jc w:val="left"/>
+            </w:pPr>
+            <w:r>
+              <w:t xml:space="preserve">Night 2: the second fake’s trigger, the prepared reply in Dani’s thread</w:t>
+            </w:r>
+          </w:p>
+        </w:tc>
+      </w:tr>
+      <w:tr>
+        <w:tc>
+          <w:tcPr/>
+          <w:p>
+            <w:pPr>
+              <w:pStyle w:val="Compact"/>
+              <w:jc w:val="left"/>
+            </w:pPr>
+            <w:r>
+              <w:t xml:space="preserve">10-24</w:t>
+            </w:r>
+          </w:p>
+        </w:tc>
+        <w:tc>
+          <w:tcPr/>
+          <w:p>
+            <w:pPr>
+              <w:pStyle w:val="Compact"/>
+              <w:jc w:val="left"/>
+            </w:pPr>
+            <w:r>
+              <w:t xml:space="preserve">Night 2: here or text</w:t>
+            </w:r>
+          </w:p>
+        </w:tc>
+      </w:tr>
+      <w:tr>
+        <w:tc>
+          <w:tcPr/>
+          <w:p>
+            <w:pPr>
+              <w:pStyle w:val="Compact"/>
+              <w:jc w:val="left"/>
+            </w:pPr>
+            <w:r>
+              <w:t xml:space="preserve">10-24</w:t>
+            </w:r>
+          </w:p>
+        </w:tc>
+        <w:tc>
+          <w:tcPr/>
+          <w:p>
+            <w:pPr>
+              <w:pStyle w:val="Compact"/>
+              <w:jc w:val="left"/>
+            </w:pPr>
+            <w:r>
+              <w:t xml:space="preserve">Night 2: the morning</w:t>
+            </w:r>
+          </w:p>
+        </w:tc>
+      </w:tr>
+      <w:tr>
+        <w:tc>
+          <w:tcPr/>
+          <w:p>
+            <w:pPr>
+              <w:pStyle w:val="Compact"/>
+              <w:jc w:val="left"/>
+            </w:pPr>
+            <w:r>
+              <w:t xml:space="preserve">10-24</w:t>
+            </w:r>
+          </w:p>
+        </w:tc>
+        <w:tc>
+          <w:tcPr/>
+          <w:p>
+            <w:pPr>
+              <w:pStyle w:val="Compact"/>
+              <w:jc w:val="left"/>
+            </w:pPr>
+            <w:r>
+              <w:t xml:space="preserve">Night 2: the day, the return, Juno’s silence</w:t>
+            </w:r>
+          </w:p>
+        </w:tc>
+      </w:tr>
+      <w:tr>
+        <w:tc>
+          <w:tcPr/>
+          <w:p>
+            <w:pPr>
+              <w:pStyle w:val="Compact"/>
+              <w:jc w:val="left"/>
+            </w:pPr>
+            <w:r>
+              <w:t xml:space="preserve">10-24</w:t>
+            </w:r>
+          </w:p>
+        </w:tc>
+        <w:tc>
+          <w:tcPr/>
+          <w:p>
+            <w:pPr>
+              <w:pStyle w:val="Compact"/>
+              <w:jc w:val="left"/>
+            </w:pPr>
+            <w:r>
+              <w:t xml:space="preserve">Juno’s switch from Night 1; the second fake’s fallback; delivery vs reading order</w:t>
+            </w:r>
+          </w:p>
+        </w:tc>
+      </w:tr>
+      <w:tr>
+        <w:tc>
+          <w:tcPr/>
+          <w:p>
+            <w:pPr>
+              <w:pStyle w:val="Compact"/>
+              <w:jc w:val="left"/>
+            </w:pPr>
+            <w:r>
+              <w:t xml:space="preserve">10-24</w:t>
+            </w:r>
+          </w:p>
+        </w:tc>
+        <w:tc>
+          <w:tcPr/>
+          <w:p>
+            <w:pPr>
+              <w:pStyle w:val="Compact"/>
+              <w:jc w:val="left"/>
+            </w:pPr>
+            <w:r>
+              <w:t xml:space="preserve">Night 2: Rachel’s share, Check-in, hand-over to Night 3</w:t>
+            </w:r>
+          </w:p>
+        </w:tc>
+      </w:tr>
+      <w:tr>
+        <w:tc>
+          <w:tcPr/>
+          <w:p>
+            <w:pPr>
+              <w:pStyle w:val="Compact"/>
+              <w:jc w:val="left"/>
+            </w:pPr>
+            <w:r>
+              <w:t xml:space="preserve">10-24</w:t>
+            </w:r>
+          </w:p>
+        </w:tc>
+        <w:tc>
+          <w:tcPr/>
+          <w:p>
+            <w:pPr>
+              <w:pStyle w:val="Compact"/>
+              <w:jc w:val="left"/>
+            </w:pPr>
+            <w:r>
+              <w:t xml:space="preserve">A Unity room prototype</w:t>
+            </w:r>
+          </w:p>
+        </w:tc>
+      </w:tr>
+      <w:tr>
+        <w:tc>
+          <w:tcPr/>
+          <w:p>
+            <w:pPr>
+              <w:pStyle w:val="Compact"/>
+              <w:jc w:val="left"/>
+            </w:pPr>
+            <w:r>
+              <w:t xml:space="preserve">10-24</w:t>
+            </w:r>
+          </w:p>
+        </w:tc>
+        <w:tc>
+          <w:tcPr/>
+          <w:p>
+            <w:pPr>
+              <w:pStyle w:val="Compact"/>
+              <w:jc w:val="left"/>
+            </w:pPr>
+            <w:r>
+              <w:t xml:space="preserve">A second session checked the Unity prototype</w:t>
+            </w:r>
+          </w:p>
+        </w:tc>
+      </w:tr>
+      <w:tr>
+        <w:tc>
+          <w:tcPr/>
+          <w:p>
+            <w:pPr>
+              <w:pStyle w:val="Compact"/>
+              <w:jc w:val="left"/>
+            </w:pPr>
+            <w:r>
+              <w:t xml:space="preserve">10-24</w:t>
+            </w:r>
+          </w:p>
+        </w:tc>
+        <w:tc>
+          <w:tcPr/>
+          <w:p>
+            <w:pPr>
+              <w:pStyle w:val="Compact"/>
+              <w:jc w:val="left"/>
+            </w:pPr>
+            <w:r>
+              <w:t xml:space="preserve">The full game moves to Unity</w:t>
+            </w:r>
+          </w:p>
+        </w:tc>
+      </w:tr>
+      <w:tr>
+        <w:tc>
+          <w:tcPr/>
+          <w:p>
+            <w:pPr>
+              <w:pStyle w:val="Compact"/>
+              <w:jc w:val="left"/>
+            </w:pPr>
+            <w:r>
+              <w:t xml:space="preserve">10-24</w:t>
+            </w:r>
+          </w:p>
+        </w:tc>
+        <w:tc>
+          <w:tcPr/>
+          <w:p>
+            <w:pPr>
+              <w:pStyle w:val="Compact"/>
+              <w:jc w:val="left"/>
+            </w:pPr>
+            <w:r>
+              <w:t xml:space="preserve">Answering the Unity session’s foundation plan</w:t>
+            </w:r>
+          </w:p>
+        </w:tc>
+      </w:tr>
+      <w:tr>
+        <w:tc>
+          <w:tcPr/>
+          <w:p>
+            <w:pPr>
+              <w:pStyle w:val="Compact"/>
+              <w:jc w:val="left"/>
+            </w:pPr>
+            <w:r>
+              <w:t xml:space="preserve">10-24</w:t>
+            </w:r>
+          </w:p>
+        </w:tc>
+        <w:tc>
+          <w:tcPr/>
+          <w:p>
+            <w:pPr>
+              <w:pStyle w:val="Compact"/>
+              <w:jc w:val="left"/>
+            </w:pPr>
+            <w:r>
+              <w:t xml:space="preserve">Model intents and platform</w:t>
+            </w:r>
+          </w:p>
+        </w:tc>
+      </w:tr>
+      <w:tr>
+        <w:tc>
+          <w:tcPr/>
+          <w:p>
+            <w:pPr>
+              <w:pStyle w:val="Compact"/>
+              <w:jc w:val="left"/>
+            </w:pPr>
+            <w:r>
+              <w:t xml:space="preserve">10-25</w:t>
+            </w:r>
+          </w:p>
+        </w:tc>
+        <w:tc>
+          <w:tcPr/>
+          <w:p>
+            <w:pPr>
+              <w:pStyle w:val="Compact"/>
+              <w:jc w:val="left"/>
+            </w:pPr>
+            <w:r>
+              <w:t xml:space="preserve">ID conventions and three types of row</w:t>
+            </w:r>
+          </w:p>
+        </w:tc>
+      </w:tr>
+      <w:tr>
+        <w:tc>
+          <w:tcPr/>
+          <w:p>
+            <w:pPr>
+              <w:pStyle w:val="Compact"/>
+              <w:jc w:val="left"/>
+            </w:pPr>
+            <w:r>
+              <w:t xml:space="preserve">10-25</w:t>
+            </w:r>
+          </w:p>
+        </w:tc>
+        <w:tc>
+          <w:tcPr/>
+          <w:p>
+            <w:pPr>
+              <w:pStyle w:val="Compact"/>
+              <w:jc w:val="left"/>
+            </w:pPr>
+            <w:r>
+              <w:t xml:space="preserve">Save schema revised for the store</w:t>
+            </w:r>
+          </w:p>
+        </w:tc>
+      </w:tr>
+      <w:tr>
+        <w:tc>
+          <w:tcPr/>
+          <w:p>
+            <w:pPr>
+              <w:pStyle w:val="Compact"/>
+              <w:jc w:val="left"/>
+            </w:pPr>
+            <w:r>
+              <w:t xml:space="preserve">10-26</w:t>
+            </w:r>
+          </w:p>
+        </w:tc>
+        <w:tc>
+          <w:tcPr/>
+          <w:p>
+            <w:pPr>
+              <w:pStyle w:val="Compact"/>
+              <w:jc w:val="left"/>
+            </w:pPr>
+            <w:r>
+              <w:t xml:space="preserve">Project 1 submission materials</w:t>
+            </w:r>
+          </w:p>
+        </w:tc>
+      </w:tr>
+      <w:tr>
+        <w:tc>
+          <w:tcPr/>
+          <w:p>
+            <w:pPr>
+              <w:pStyle w:val="Compact"/>
+              <w:jc w:val="left"/>
+            </w:pPr>
+            <w:r>
+              <w:t xml:space="preserve">10-27</w:t>
+            </w:r>
+          </w:p>
+        </w:tc>
+        <w:tc>
+          <w:tcPr/>
+          <w:p>
+            <w:pPr>
+              <w:pStyle w:val="Compact"/>
+              <w:jc w:val="left"/>
+            </w:pPr>
+            <w:r>
+              <w:t xml:space="preserve">Project 1 essay checked</w:t>
+            </w:r>
+          </w:p>
+        </w:tc>
+      </w:tr>
+      <w:tr>
+        <w:tc>
+          <w:tcPr/>
+          <w:p>
+            <w:pPr>
+              <w:pStyle w:val="Compact"/>
+              <w:jc w:val="left"/>
+            </w:pPr>
+            <w:r>
+              <w:t xml:space="preserve">10-27</w:t>
+            </w:r>
+          </w:p>
+        </w:tc>
+        <w:tc>
+          <w:tcPr/>
+          <w:p>
+            <w:pPr>
+              <w:pStyle w:val="Compact"/>
+              <w:jc w:val="left"/>
+            </w:pPr>
+            <w:r>
+              <w:t xml:space="preserve">An example paragraph for the essay</w:t>
+            </w:r>
+          </w:p>
+        </w:tc>
+      </w:tr>
+      <w:tr>
+        <w:tc>
+          <w:tcPr/>
+          <w:p>
+            <w:pPr>
+              <w:pStyle w:val="Compact"/>
+              <w:jc w:val="left"/>
+            </w:pPr>
+            <w:r>
+              <w:t xml:space="preserve">10-27</w:t>
+            </w:r>
+          </w:p>
+        </w:tc>
+        <w:tc>
+          <w:tcPr/>
+          <w:p>
+            <w:pPr>
+              <w:pStyle w:val="Compact"/>
+              <w:jc w:val="left"/>
+            </w:pPr>
+            <w:r>
+              <w:t xml:space="preserve">Final essay laid out, and this log’s open decisions filled</w:t>
+            </w:r>
+          </w:p>
+        </w:tc>
+      </w:tr>
+      <w:tr>
+        <w:tc>
+          <w:tcPr/>
+          <w:p>
+            <w:pPr>
+              <w:pStyle w:val="Compact"/>
+              <w:jc w:val="left"/>
+            </w:pPr>
+            <w:r>
+              <w:t xml:space="preserve">10-27</w:t>
+            </w:r>
+          </w:p>
+        </w:tc>
+        <w:tc>
+          <w:tcPr/>
+          <w:p>
+            <w:pPr>
+              <w:pStyle w:val="Compact"/>
+              <w:jc w:val="left"/>
+            </w:pPr>
+            <w:r>
+              <w:t xml:space="preserve">Correction: the critiques credited to ChatGPT were mine</w:t>
+            </w:r>
+          </w:p>
+        </w:tc>
+      </w:tr>
+      <w:tr>
+        <w:tc>
+          <w:tcPr/>
+          <w:p>
+            <w:pPr>
+              <w:pStyle w:val="Compact"/>
+              <w:jc w:val="left"/>
+            </w:pPr>
+            <w:r>
+              <w:t xml:space="preserve">10-27</w:t>
+            </w:r>
+          </w:p>
+        </w:tc>
+        <w:tc>
+          <w:tcPr/>
+          <w:p>
+            <w:pPr>
+              <w:pStyle w:val="Compact"/>
+              <w:jc w:val="left"/>
+            </w:pPr>
+            <w:r>
+              <w:t xml:space="preserve">The essay’s appendix expanded</w:t>
+            </w:r>
+          </w:p>
+        </w:tc>
+      </w:tr>
+    </w:tbl>
+    <w:bookmarkEnd w:id="47"/>
+    <w:bookmarkEnd w:id="48"/>
     <w:sectPr/>
   </w:body>
 </w:document>

</xml_diff>

<commit_message>
Record the critiques and proposals as mine without a correction note.
</commit_message>
<xml_diff>
--- a/docs/project1/final/Huang_Project1_Essay.docx
+++ b/docs/project1/final/Huang_Project1_Essay.docx
@@ -842,7 +842,7 @@
         <w:t xml:space="preserve"> </w:t>
       </w:r>
       <w:r>
-        <w:t xml:space="preserve">in the project repository: 103 dated entries, 2026-09-24 to 2026-10-27), which records each AI-assisted step and my decision about it.</w:t>
+        <w:t xml:space="preserve">in the project repository: 102 dated entries, 2026-09-24 to 2026-10-27), which records each AI-assisted step and my decision about it.</w:t>
       </w:r>
     </w:p>
     <w:p>
@@ -5453,32 +5453,6 @@
             </w:pPr>
             <w:r>
               <w:t xml:space="preserve">Final essay laid out, and this log’s open decisions filled</w:t>
-            </w:r>
-          </w:p>
-        </w:tc>
-      </w:tr>
-      <w:tr>
-        <w:tc>
-          <w:tcPr/>
-          <w:p>
-            <w:pPr>
-              <w:pStyle w:val="Compact"/>
-              <w:jc w:val="left"/>
-            </w:pPr>
-            <w:r>
-              <w:t xml:space="preserve">10-27</w:t>
-            </w:r>
-          </w:p>
-        </w:tc>
-        <w:tc>
-          <w:tcPr/>
-          <w:p>
-            <w:pPr>
-              <w:pStyle w:val="Compact"/>
-              <w:jc w:val="left"/>
-            </w:pPr>
-            <w:r>
-              <w:t xml:space="preserve">Correction: the critiques credited to ChatGPT were mine</w:t>
             </w:r>
           </w:p>
         </w:tc>

</xml_diff>